<commit_message>
Add Team 2 member names to the project report
Filled in the cover page, title block and Bona Fide Certificate with all
four team members (Mohalraj Shivanethran, Pranesh Subramanian, Srinath
Balakrishnan, Umasuthan Palaniappan) and tightened cover-page spacing to
keep the report at 30 pages.

Co-Authored-By: Claude Sonnet 5 <noreply@anthropic.com>
Claude-Session: https://claude.ai/code/session_018bJGGE565k5p89XXbVeEsb
</commit_message>
<xml_diff>
--- a/pyrolysis_advisor/docs/BioOil_Pyrolysis_Advisor_FullReport.docx
+++ b/pyrolysis_advisor/docs/BioOil_Pyrolysis_Advisor_FullReport.docx
@@ -4,12 +4,12 @@
   <w:body>
     <w:p>
       <w:pPr>
-        <w:spacing w:before="600"/>
-      </w:pPr>
-    </w:p>
-    <w:p>
-      <w:pPr>
-        <w:spacing w:after="300" w:before="400" w:line="360"/>
+        <w:spacing w:before="200"/>
+      </w:pPr>
+    </w:p>
+    <w:p>
+      <w:pPr>
+        <w:spacing w:after="300" w:before="200" w:line="360"/>
         <w:jc w:val="center"/>
       </w:pPr>
       <w:r>
@@ -57,7 +57,7 @@
     </w:p>
     <w:p>
       <w:pPr>
-        <w:spacing w:after="100"/>
+        <w:spacing w:after="40"/>
         <w:jc w:val="center"/>
       </w:pPr>
       <w:r>
@@ -65,27 +65,58 @@
           <w:rFonts w:ascii="Times New Roman" w:cs="Times New Roman" w:eastAsia="Times New Roman" w:hAnsi="Times New Roman"/>
           <w:b/>
           <w:bCs/>
-          <w:sz w:val="32"/>
-          <w:szCs w:val="32"/>
+          <w:sz w:val="28"/>
+          <w:szCs w:val="28"/>
+        </w:rPr>
+        <w:t xml:space="preserve">MOHALRAJ SHIVANETHRAN (CB.AI.U4AIM25020)</w:t>
+      </w:r>
+    </w:p>
+    <w:p>
+      <w:pPr>
+        <w:spacing w:after="40"/>
+        <w:jc w:val="center"/>
+      </w:pPr>
+      <w:r>
+        <w:rPr>
+          <w:rFonts w:ascii="Times New Roman" w:cs="Times New Roman" w:eastAsia="Times New Roman" w:hAnsi="Times New Roman"/>
+          <w:b/>
+          <w:bCs/>
+          <w:sz w:val="28"/>
+          <w:szCs w:val="28"/>
+        </w:rPr>
+        <w:t xml:space="preserve">PRANESH SUBRAMANIAN (CB.AI.U4AIM25030)</w:t>
+      </w:r>
+    </w:p>
+    <w:p>
+      <w:pPr>
+        <w:spacing w:after="40"/>
+        <w:jc w:val="center"/>
+      </w:pPr>
+      <w:r>
+        <w:rPr>
+          <w:rFonts w:ascii="Times New Roman" w:cs="Times New Roman" w:eastAsia="Times New Roman" w:hAnsi="Times New Roman"/>
+          <w:b/>
+          <w:bCs/>
+          <w:sz w:val="28"/>
+          <w:szCs w:val="28"/>
+        </w:rPr>
+        <w:t xml:space="preserve">SRINATH BALAKRISHNAN (CB.AI.U4AIM25040)</w:t>
+      </w:r>
+    </w:p>
+    <w:p>
+      <w:pPr>
+        <w:spacing w:after="350"/>
+        <w:jc w:val="center"/>
+      </w:pPr>
+      <w:r>
+        <w:rPr>
+          <w:rFonts w:ascii="Times New Roman" w:cs="Times New Roman" w:eastAsia="Times New Roman" w:hAnsi="Times New Roman"/>
+          <w:b/>
+          <w:bCs/>
+          <w:sz w:val="28"/>
+          <w:szCs w:val="28"/>
         </w:rPr>
         <w:t xml:space="preserve">UMASUTHAN PALANIAPPAN (CB.AI.U4AIM25041)</w:t>
-      </w:r>
-    </w:p>
-    <w:p>
-      <w:pPr>
-        <w:spacing w:after="500"/>
-        <w:jc w:val="center"/>
-      </w:pPr>
-      <w:r>
-        <w:rPr>
-          <w:rFonts w:ascii="Times New Roman" w:cs="Times New Roman" w:eastAsia="Times New Roman" w:hAnsi="Times New Roman"/>
-          <w:i/>
-          <w:iCs/>
-          <w:color w:val="808080"/>
-          <w:sz w:val="22"/>
-          <w:szCs w:val="22"/>
-        </w:rPr>
-        <w:t xml:space="preserve">[Add team member name(s) and registration number(s) here, one below the other]</w:t>
       </w:r>
     </w:p>
     <w:p>
@@ -382,7 +413,7 @@
           <w:sz w:val="24"/>
           <w:szCs w:val="24"/>
         </w:rPr>
-        <w:t xml:space="preserve">This is to certify that the project report entitled "PHYSICS-AWARE MACHINE LEARNING FOR BIO-OIL PYROLYSIS: AN HONEST BENCHMARK AND A PYROLYSIS ADVISOR FOR HIGHER YIELD AND LOWER OXYGEN" submitted by Umasuthan Palaniappan (CB.AI.U4AIM25041) [and team member(s) to be added] in partial fulfillment of the requirements for the award of the Degree of Bachelor of Technology in Artificial Intelligence and Data Science Engineering is a bona fide record of the work carried out under my guidance and supervision at Amrita School of Engineering, Coimbatore.</w:t>
+        <w:t xml:space="preserve">This is to certify that the project report entitled "PHYSICS-AWARE MACHINE LEARNING FOR BIO-OIL PYROLYSIS: AN HONEST BENCHMARK AND A PYROLYSIS ADVISOR FOR HIGHER YIELD AND LOWER OXYGEN" submitted by Mohalraj Shivanethran (CB.AI.U4AIM25020), Pranesh Subramanian (CB.AI.U4AIM25030), Srinath Balakrishnan (CB.AI.U4AIM25040) and Umasuthan Palaniappan (CB.AI.U4AIM25041) in partial fulfillment of the requirements for the award of the Degree of Bachelor of Technology in Artificial Intelligence and Data Science Engineering is a bona fide record of the work carried out under my guidance and supervision at Amrita School of Engineering, Coimbatore.</w:t>
       </w:r>
     </w:p>
     <w:tbl>
@@ -670,7 +701,7 @@
                 <w:sz w:val="24"/>
                 <w:szCs w:val="24"/>
               </w:rPr>
-              <w:t xml:space="preserve">Umasuthan Palaniappan (CB.AI.U4AIM25041)</w:t>
+              <w:t xml:space="preserve">Mohalraj Shivanethran (CB.AI.U4AIM25020)</w:t>
             </w:r>
           </w:p>
         </w:tc>
@@ -721,10 +752,10 @@
               <w:rPr>
                 <w:rFonts w:ascii="Times New Roman" w:cs="Times New Roman" w:eastAsia="Times New Roman" w:hAnsi="Times New Roman"/>
                 <w:color w:val="000000"/>
-                <w:sz w:val="18"/>
-                <w:szCs w:val="18"/>
-              </w:rPr>
-              <w:t xml:space="preserve">[Add additional team member signature lines here]</w:t>
+                <w:sz w:val="24"/>
+                <w:szCs w:val="24"/>
+              </w:rPr>
+              <w:t xml:space="preserve">Pranesh Subramanian (CB.AI.U4AIM25030)</w:t>
             </w:r>
           </w:p>
         </w:tc>
@@ -778,7 +809,61 @@
                 <w:sz w:val="24"/>
                 <w:szCs w:val="24"/>
               </w:rPr>
+              <w:t xml:space="preserve">Srinath Balakrishnan (CB.AI.U4AIM25040)</w:t>
+            </w:r>
+          </w:p>
+        </w:tc>
+      </w:tr>
+      <w:tr>
+        <w:tc>
+          <w:tcPr>
+            <w:tcW w:type="dxa" w:w="4500"/>
+            <w:tcMar>
+              <w:top w:type="dxa" w:w="80"/>
+              <w:left w:type="dxa" w:w="100"/>
+              <w:bottom w:type="dxa" w:w="80"/>
+              <w:right w:type="dxa" w:w="100"/>
+            </w:tcMar>
+            <w:vAlign w:val="center"/>
+          </w:tcPr>
+          <w:p>
+            <w:pPr>
+              <w:jc w:val="left"/>
+            </w:pPr>
+            <w:r>
+              <w:rPr>
+                <w:rFonts w:ascii="Times New Roman" w:cs="Times New Roman" w:eastAsia="Times New Roman" w:hAnsi="Times New Roman"/>
+                <w:color w:val="000000"/>
+                <w:sz w:val="24"/>
+                <w:szCs w:val="24"/>
+              </w:rPr>
               <w:t xml:space="preserve"/>
+            </w:r>
+          </w:p>
+        </w:tc>
+        <w:tc>
+          <w:tcPr>
+            <w:tcW w:type="dxa" w:w="4500"/>
+            <w:tcMar>
+              <w:top w:type="dxa" w:w="80"/>
+              <w:left w:type="dxa" w:w="100"/>
+              <w:bottom w:type="dxa" w:w="80"/>
+              <w:right w:type="dxa" w:w="100"/>
+            </w:tcMar>
+            <w:vAlign w:val="center"/>
+          </w:tcPr>
+          <w:p>
+            <w:pPr>
+              <w:jc w:val="left"/>
+            </w:pPr>
+            <w:r>
+              <w:rPr>
+                <w:rFonts w:ascii="Times New Roman" w:cs="Times New Roman" w:eastAsia="Times New Roman" w:hAnsi="Times New Roman"/>
+                <w:color w:val="000000"/>
+                <w:sz w:val="24"/>
+                <w:szCs w:val="24"/>
+              </w:rPr>
+              <w:t xml:space="preserve">Umasuthan Palaniappan (CB.AI.U4AIM25041)</w:t>
             </w:r>
           </w:p>
         </w:tc>

</xml_diff>

<commit_message>
Report: add a headline results table so each R² names its model and test
Readers saw R² values from different models and test protocols side by
side and could not tell them apart. Chapter 6 now opens with Table 6.1
(three headline results: best single O/C model 0.90 on Test 1; final
Advisor model 0.61/0.27 for O/C and 0.61/0.07 for yield on Test 1/Test
2), explains why 0.90 and 0.61 differ, and renumbers the per-algorithm
table to 6.2. The parity figure no longer prints its own R², which did
not match the 10-split average quoted in the text.

Also restores the cover logo, keeps the team's BONAFIDE wording, fills
the contents on open, and stays at 30 pages.

Co-Authored-By: Claude Opus 5.5 <noreply@anthropic.com>
Claude-Session: https://claude.ai/code/session_018bJGGE565k5p89XXbVeEsb
</commit_message>
<xml_diff>
--- a/pyrolysis_advisor/docs/BioOil_Pyrolysis_Advisor_FullReport.docx
+++ b/pyrolysis_advisor/docs/BioOil_Pyrolysis_Advisor_FullReport.docx
@@ -341,13 +341,13 @@
     </w:p>
     <w:p>
       <w:pPr>
-        <w:spacing w:after="400"/>
+        <w:spacing w:after="150"/>
         <w:jc w:val="center"/>
       </w:pPr>
       <w:r>
         <w:drawing>
           <wp:inline distT="0" distB="0" distL="0" distR="0">
-            <wp:extent cx="914400" cy="1114425"/>
+            <wp:extent cx="638175" cy="781050"/>
             <wp:effectExtent t="0" r="0" b="0" l="0"/>
             <wp:docPr id="1" name="" descr="" title=""/>
             <wp:cNvGraphicFramePr>
@@ -372,7 +372,7 @@
                   <pic:spPr bwMode="auto">
                     <a:xfrm>
                       <a:off x="0" y="0"/>
-                      <a:ext cx="914400" cy="1114425"/>
+                      <a:ext cx="638175" cy="781050"/>
                     </a:xfrm>
                     <a:prstGeom prst="rect">
                       <a:avLst/>
@@ -387,7 +387,7 @@
     </w:p>
     <w:p>
       <w:pPr>
-        <w:spacing w:after="400"/>
+        <w:spacing w:after="200"/>
         <w:jc w:val="center"/>
       </w:pPr>
       <w:r>
@@ -399,12 +399,12 @@
           <w:szCs w:val="28"/>
           <w:u w:val="single"/>
         </w:rPr>
-        <w:t xml:space="preserve">BONA FIDE CERTIFICATE</w:t>
-      </w:r>
-    </w:p>
-    <w:p>
-      <w:pPr>
-        <w:spacing w:after="700" w:before="0" w:line="360"/>
+        <w:t xml:space="preserve">BONAFIDE CERTIFICATE</w:t>
+      </w:r>
+    </w:p>
+    <w:p>
+      <w:pPr>
+        <w:spacing w:after="120" w:before="0" w:line="276"/>
         <w:jc w:val="both"/>
       </w:pPr>
       <w:r>
@@ -506,10 +506,10 @@
               <w:rPr>
                 <w:rFonts w:ascii="Times New Roman" w:cs="Times New Roman" w:eastAsia="Times New Roman" w:hAnsi="Times New Roman"/>
                 <w:color w:val="000000"/>
-                <w:sz w:val="20"/>
-                <w:szCs w:val="20"/>
-              </w:rPr>
-              <w:t xml:space="preserve"/>
+                <w:sz w:val="24"/>
+                <w:szCs w:val="24"/>
+              </w:rPr>
+              <w:t xml:space="preserve">_____________________________</w:t>
             </w:r>
           </w:p>
         </w:tc>
@@ -532,10 +532,10 @@
               <w:rPr>
                 <w:rFonts w:ascii="Times New Roman" w:cs="Times New Roman" w:eastAsia="Times New Roman" w:hAnsi="Times New Roman"/>
                 <w:color w:val="000000"/>
-                <w:sz w:val="20"/>
-                <w:szCs w:val="20"/>
-              </w:rPr>
-              <w:t xml:space="preserve"/>
+                <w:sz w:val="24"/>
+                <w:szCs w:val="24"/>
+              </w:rPr>
+              <w:t xml:space="preserve">_____________________________</w:t>
             </w:r>
           </w:p>
         </w:tc>
@@ -559,11 +559,13 @@
             <w:r>
               <w:rPr>
                 <w:rFonts w:ascii="Times New Roman" w:cs="Times New Roman" w:eastAsia="Times New Roman" w:hAnsi="Times New Roman"/>
+                <w:b/>
+                <w:bCs/>
                 <w:color w:val="000000"/>
                 <w:sz w:val="24"/>
                 <w:szCs w:val="24"/>
               </w:rPr>
-              <w:t xml:space="preserve">_____________________________</w:t>
+              <w:t xml:space="preserve">Signature of Supervisor</w:t>
             </w:r>
           </w:p>
         </w:tc>
@@ -585,11 +587,13 @@
             <w:r>
               <w:rPr>
                 <w:rFonts w:ascii="Times New Roman" w:cs="Times New Roman" w:eastAsia="Times New Roman" w:hAnsi="Times New Roman"/>
+                <w:b/>
+                <w:bCs/>
                 <w:color w:val="000000"/>
                 <w:sz w:val="24"/>
                 <w:szCs w:val="24"/>
               </w:rPr>
-              <w:t xml:space="preserve">_____________________________</w:t>
+              <w:t xml:space="preserve">Signature of Student</w:t>
             </w:r>
           </w:p>
         </w:tc>
@@ -613,13 +617,11 @@
             <w:r>
               <w:rPr>
                 <w:rFonts w:ascii="Times New Roman" w:cs="Times New Roman" w:eastAsia="Times New Roman" w:hAnsi="Times New Roman"/>
-                <w:b/>
-                <w:bCs/>
                 <w:color w:val="000000"/>
                 <w:sz w:val="24"/>
                 <w:szCs w:val="24"/>
               </w:rPr>
-              <w:t xml:space="preserve">Signature of Supervisor</w:t>
+              <w:t xml:space="preserve">Dr. Akhil Mohan</w:t>
             </w:r>
           </w:p>
         </w:tc>
@@ -641,13 +643,21 @@
             <w:r>
               <w:rPr>
                 <w:rFonts w:ascii="Times New Roman" w:cs="Times New Roman" w:eastAsia="Times New Roman" w:hAnsi="Times New Roman"/>
-                <w:b/>
-                <w:bCs/>
                 <w:color w:val="000000"/>
                 <w:sz w:val="24"/>
                 <w:szCs w:val="24"/>
               </w:rPr>
-              <w:t xml:space="preserve">Signature of Student</w:t>
+              <w:t xml:space="preserve">Mohalraj Shivanethran</w:t>
+            </w:r>
+            <w:r>
+              <w:rPr>
+                <w:rFonts w:ascii="Times New Roman" w:cs="Times New Roman" w:eastAsia="Times New Roman" w:hAnsi="Times New Roman"/>
+                <w:color w:val="000000"/>
+                <w:sz w:val="24"/>
+                <w:szCs w:val="24"/>
+              </w:rPr>
+              <w:br/>
+              <w:t xml:space="preserve">(CB.AI.U4AIM25020)</w:t>
             </w:r>
           </w:p>
         </w:tc>
@@ -675,7 +685,7 @@
                 <w:sz w:val="24"/>
                 <w:szCs w:val="24"/>
               </w:rPr>
-              <w:t xml:space="preserve">Dr. Akhil Mohan</w:t>
+              <w:t xml:space="preserve">Assistant Professor</w:t>
             </w:r>
           </w:p>
         </w:tc>
@@ -701,7 +711,17 @@
                 <w:sz w:val="24"/>
                 <w:szCs w:val="24"/>
               </w:rPr>
-              <w:t xml:space="preserve">Mohalraj Shivanethran (CB.AI.U4AIM25020)</w:t>
+              <w:t xml:space="preserve">Pranesh Subramanian</w:t>
+            </w:r>
+            <w:r>
+              <w:rPr>
+                <w:rFonts w:ascii="Times New Roman" w:cs="Times New Roman" w:eastAsia="Times New Roman" w:hAnsi="Times New Roman"/>
+                <w:color w:val="000000"/>
+                <w:sz w:val="24"/>
+                <w:szCs w:val="24"/>
+              </w:rPr>
+              <w:br/>
+              <w:t xml:space="preserve">(CB.AI.U4AIM25030)</w:t>
             </w:r>
           </w:p>
         </w:tc>
@@ -729,25 +749,8 @@
                 <w:sz w:val="24"/>
                 <w:szCs w:val="24"/>
               </w:rPr>
-              <w:t xml:space="preserve">Assistant Professor</w:t>
-            </w:r>
-          </w:p>
-        </w:tc>
-        <w:tc>
-          <w:tcPr>
-            <w:tcW w:type="dxa" w:w="4500"/>
-            <w:tcMar>
-              <w:top w:type="dxa" w:w="80"/>
-              <w:left w:type="dxa" w:w="100"/>
-              <w:bottom w:type="dxa" w:w="80"/>
-              <w:right w:type="dxa" w:w="100"/>
-            </w:tcMar>
-            <w:vAlign w:val="center"/>
-          </w:tcPr>
-          <w:p>
-            <w:pPr>
-              <w:jc w:val="left"/>
-            </w:pPr>
+              <w:t xml:space="preserve">School of Artificial Intelligence,</w:t>
+            </w:r>
             <w:r>
               <w:rPr>
                 <w:rFonts w:ascii="Times New Roman" w:cs="Times New Roman" w:eastAsia="Times New Roman" w:hAnsi="Times New Roman"/>
@@ -755,7 +758,44 @@
                 <w:sz w:val="24"/>
                 <w:szCs w:val="24"/>
               </w:rPr>
-              <w:t xml:space="preserve">Pranesh Subramanian (CB.AI.U4AIM25030)</w:t>
+              <w:br/>
+              <w:t xml:space="preserve">Amrita Vishwa Vidyapeetham University</w:t>
+            </w:r>
+          </w:p>
+        </w:tc>
+        <w:tc>
+          <w:tcPr>
+            <w:tcW w:type="dxa" w:w="4500"/>
+            <w:tcMar>
+              <w:top w:type="dxa" w:w="80"/>
+              <w:left w:type="dxa" w:w="100"/>
+              <w:bottom w:type="dxa" w:w="80"/>
+              <w:right w:type="dxa" w:w="100"/>
+            </w:tcMar>
+            <w:vAlign w:val="center"/>
+          </w:tcPr>
+          <w:p>
+            <w:pPr>
+              <w:jc w:val="left"/>
+            </w:pPr>
+            <w:r>
+              <w:rPr>
+                <w:rFonts w:ascii="Times New Roman" w:cs="Times New Roman" w:eastAsia="Times New Roman" w:hAnsi="Times New Roman"/>
+                <w:color w:val="000000"/>
+                <w:sz w:val="24"/>
+                <w:szCs w:val="24"/>
+              </w:rPr>
+              <w:t xml:space="preserve">Srinath Balakrishnan</w:t>
+            </w:r>
+            <w:r>
+              <w:rPr>
+                <w:rFonts w:ascii="Times New Roman" w:cs="Times New Roman" w:eastAsia="Times New Roman" w:hAnsi="Times New Roman"/>
+                <w:color w:val="000000"/>
+                <w:sz w:val="24"/>
+                <w:szCs w:val="24"/>
+              </w:rPr>
+              <w:br/>
+              <w:t xml:space="preserve">(CB.AI.U4AIM25040)</w:t>
             </w:r>
           </w:p>
         </w:tc>
@@ -783,25 +823,8 @@
                 <w:sz w:val="24"/>
                 <w:szCs w:val="24"/>
               </w:rPr>
-              <w:t xml:space="preserve">School of Artificial Intelligence</w:t>
-            </w:r>
-          </w:p>
-        </w:tc>
-        <w:tc>
-          <w:tcPr>
-            <w:tcW w:type="dxa" w:w="4500"/>
-            <w:tcMar>
-              <w:top w:type="dxa" w:w="80"/>
-              <w:left w:type="dxa" w:w="100"/>
-              <w:bottom w:type="dxa" w:w="80"/>
-              <w:right w:type="dxa" w:w="100"/>
-            </w:tcMar>
-            <w:vAlign w:val="center"/>
-          </w:tcPr>
-          <w:p>
-            <w:pPr>
-              <w:jc w:val="left"/>
-            </w:pPr>
+              <w:t xml:space="preserve">Amritanagar, Coimbatore 641112,</w:t>
+            </w:r>
             <w:r>
               <w:rPr>
                 <w:rFonts w:ascii="Times New Roman" w:cs="Times New Roman" w:eastAsia="Times New Roman" w:hAnsi="Times New Roman"/>
@@ -809,12 +832,11 @@
                 <w:sz w:val="24"/>
                 <w:szCs w:val="24"/>
               </w:rPr>
-              <w:t xml:space="preserve">Srinath Balakrishnan (CB.AI.U4AIM25040)</w:t>
-            </w:r>
-          </w:p>
-        </w:tc>
-      </w:tr>
-      <w:tr>
+              <w:br/>
+              <w:t xml:space="preserve">Tamil Nadu, India</w:t>
+            </w:r>
+          </w:p>
+        </w:tc>
         <w:tc>
           <w:tcPr>
             <w:tcW w:type="dxa" w:w="4500"/>
@@ -837,25 +859,8 @@
                 <w:sz w:val="24"/>
                 <w:szCs w:val="24"/>
               </w:rPr>
-              <w:t xml:space="preserve"/>
-            </w:r>
-          </w:p>
-        </w:tc>
-        <w:tc>
-          <w:tcPr>
-            <w:tcW w:type="dxa" w:w="4500"/>
-            <w:tcMar>
-              <w:top w:type="dxa" w:w="80"/>
-              <w:left w:type="dxa" w:w="100"/>
-              <w:bottom w:type="dxa" w:w="80"/>
-              <w:right w:type="dxa" w:w="100"/>
-            </w:tcMar>
-            <w:vAlign w:val="center"/>
-          </w:tcPr>
-          <w:p>
-            <w:pPr>
-              <w:jc w:val="left"/>
-            </w:pPr>
+              <w:t xml:space="preserve">Umasuthan Palaniappan</w:t>
+            </w:r>
             <w:r>
               <w:rPr>
                 <w:rFonts w:ascii="Times New Roman" w:cs="Times New Roman" w:eastAsia="Times New Roman" w:hAnsi="Times New Roman"/>
@@ -863,115 +868,8 @@
                 <w:sz w:val="24"/>
                 <w:szCs w:val="24"/>
               </w:rPr>
-              <w:t xml:space="preserve">Umasuthan Palaniappan (CB.AI.U4AIM25041)</w:t>
-            </w:r>
-          </w:p>
-        </w:tc>
-      </w:tr>
-      <w:tr>
-        <w:tc>
-          <w:tcPr>
-            <w:tcW w:type="dxa" w:w="4500"/>
-            <w:tcMar>
-              <w:top w:type="dxa" w:w="80"/>
-              <w:left w:type="dxa" w:w="100"/>
-              <w:bottom w:type="dxa" w:w="80"/>
-              <w:right w:type="dxa" w:w="100"/>
-            </w:tcMar>
-            <w:vAlign w:val="center"/>
-          </w:tcPr>
-          <w:p>
-            <w:pPr>
-              <w:jc w:val="left"/>
-            </w:pPr>
-            <w:r>
-              <w:rPr>
-                <w:rFonts w:ascii="Times New Roman" w:cs="Times New Roman" w:eastAsia="Times New Roman" w:hAnsi="Times New Roman"/>
-                <w:color w:val="000000"/>
-                <w:sz w:val="24"/>
-                <w:szCs w:val="24"/>
-              </w:rPr>
-              <w:t xml:space="preserve">Amrita Vishwa Vidyapeetham University</w:t>
-            </w:r>
-          </w:p>
-        </w:tc>
-        <w:tc>
-          <w:tcPr>
-            <w:tcW w:type="dxa" w:w="4500"/>
-            <w:tcMar>
-              <w:top w:type="dxa" w:w="80"/>
-              <w:left w:type="dxa" w:w="100"/>
-              <w:bottom w:type="dxa" w:w="80"/>
-              <w:right w:type="dxa" w:w="100"/>
-            </w:tcMar>
-            <w:vAlign w:val="center"/>
-          </w:tcPr>
-          <w:p>
-            <w:pPr>
-              <w:jc w:val="left"/>
-            </w:pPr>
-            <w:r>
-              <w:rPr>
-                <w:rFonts w:ascii="Times New Roman" w:cs="Times New Roman" w:eastAsia="Times New Roman" w:hAnsi="Times New Roman"/>
-                <w:color w:val="000000"/>
-                <w:sz w:val="24"/>
-                <w:szCs w:val="24"/>
-              </w:rPr>
-              <w:t xml:space="preserve"/>
-            </w:r>
-          </w:p>
-        </w:tc>
-      </w:tr>
-      <w:tr>
-        <w:tc>
-          <w:tcPr>
-            <w:tcW w:type="dxa" w:w="4500"/>
-            <w:tcMar>
-              <w:top w:type="dxa" w:w="80"/>
-              <w:left w:type="dxa" w:w="100"/>
-              <w:bottom w:type="dxa" w:w="80"/>
-              <w:right w:type="dxa" w:w="100"/>
-            </w:tcMar>
-            <w:vAlign w:val="center"/>
-          </w:tcPr>
-          <w:p>
-            <w:pPr>
-              <w:jc w:val="left"/>
-            </w:pPr>
-            <w:r>
-              <w:rPr>
-                <w:rFonts w:ascii="Times New Roman" w:cs="Times New Roman" w:eastAsia="Times New Roman" w:hAnsi="Times New Roman"/>
-                <w:color w:val="000000"/>
-                <w:sz w:val="24"/>
-                <w:szCs w:val="24"/>
-              </w:rPr>
-              <w:t xml:space="preserve">Amritanagar, Coimbatore 641112, Tamil Nadu, India</w:t>
-            </w:r>
-          </w:p>
-        </w:tc>
-        <w:tc>
-          <w:tcPr>
-            <w:tcW w:type="dxa" w:w="4500"/>
-            <w:tcMar>
-              <w:top w:type="dxa" w:w="80"/>
-              <w:left w:type="dxa" w:w="100"/>
-              <w:bottom w:type="dxa" w:w="80"/>
-              <w:right w:type="dxa" w:w="100"/>
-            </w:tcMar>
-            <w:vAlign w:val="center"/>
-          </w:tcPr>
-          <w:p>
-            <w:pPr>
-              <w:jc w:val="left"/>
-            </w:pPr>
-            <w:r>
-              <w:rPr>
-                <w:rFonts w:ascii="Times New Roman" w:cs="Times New Roman" w:eastAsia="Times New Roman" w:hAnsi="Times New Roman"/>
-                <w:color w:val="000000"/>
-                <w:sz w:val="24"/>
-                <w:szCs w:val="24"/>
-              </w:rPr>
-              <w:t xml:space="preserve"/>
+              <w:br/>
+              <w:t xml:space="preserve">(CB.AI.U4AIM25041)</w:t>
             </w:r>
           </w:p>
         </w:tc>
@@ -979,7 +877,7 @@
     </w:tbl>
     <w:p>
       <w:pPr>
-        <w:spacing w:after="200" w:before="700"/>
+        <w:spacing w:after="80" w:before="200"/>
       </w:pPr>
       <w:r>
         <w:rPr>
@@ -1008,7 +906,7 @@
     </w:p>
     <w:p>
       <w:pPr>
-        <w:spacing w:after="500" w:before="0" w:line="360"/>
+        <w:spacing w:after="200" w:before="0" w:line="360"/>
         <w:jc w:val="both"/>
       </w:pPr>
       <w:r>
@@ -1022,7 +920,7 @@
     </w:p>
     <w:p>
       <w:pPr>
-        <w:spacing w:after="500" w:before="0" w:line="360"/>
+        <w:spacing w:after="360" w:before="0" w:line="360"/>
         <w:jc w:val="both"/>
       </w:pPr>
       <w:r>
@@ -1278,7 +1176,7 @@
           <w:sz w:val="24"/>
           <w:szCs w:val="24"/>
         </w:rPr>
-        <w:t xml:space="preserve">Machine learning (ML) is increasingly used to predict bio-oil yield and quality from biomass composition and pyrolysis conditions, and published models often report R² above 0.75. This project builds physics-aware ML models for bio-oil O/C ratio (Zhang et al. 2022 dataset) and bio-liquid yield (Pascarella et al. 2025 dataset, 1,046 rows) and benchmarks them against published results. On the standard 80/20 random train/test split used in the literature (Test 1), the best O/C model (XGBoost with physics-informed features) reaches R² = 0.90, level with Zhang et al.'s 0.895 and ahead of six other model types; yield models reach R² up to 0.69, and the final Advisor models average R² ≈ 0.61 for both targets over ten random splits. As a second, stricter check (Test 2), whole biomasses were held out of training: scores are lower (O/C R² 0.23–0.27, yield near zero), mainly because the compiled yield data mixes about 160 laboratories, and this tells the user when a calibration experiment is needed.</w:t>
+        <w:t xml:space="preserve">Machine learning (ML) is increasingly used to predict bio-oil yield and quality from biomass composition and pyrolysis conditions, and published models often report R² above 0.75. This project builds physics-aware ML models for bio-oil O/C ratio (Zhang et al. 2022 dataset) and bio-liquid yield (Pascarella et al. 2025 dataset, 1,046 rows) and benchmarks them against published results. On the standard 80/20 random train/test split used in the literature (Test 1), the best O/C model (XGBoost with physics-informed features) reaches R² = 0.90, level with Zhang et al.'s 0.895 and ahead of six other model types; yield models reach R² up to 0.69, and the final Advisor models average R² ≈ 0.61 for both targets over ten random splits. As a second, stricter check (Test 2), whole biomasses were held out of training: the final Advisor models score lower (O/C R² 0.27, yield 0.07), mainly because the compiled yield data mixes about 160 laboratories, and this tells the user when a calibration experiment is needed.</w:t>
       </w:r>
     </w:p>
     <w:p>
@@ -1350,22 +1248,6 @@
     </w:sdt>
     <w:p>
       <w:pPr>
-        <w:spacing w:after="0" w:before="0" w:line="360"/>
-        <w:jc w:val="both"/>
-      </w:pPr>
-      <w:r>
-        <w:rPr>
-          <w:rFonts w:ascii="Times New Roman" w:cs="Times New Roman" w:eastAsia="Times New Roman" w:hAnsi="Times New Roman"/>
-          <w:i/>
-          <w:iCs/>
-          <w:sz w:val="18"/>
-          <w:szCs w:val="18"/>
-        </w:rPr>
-        <w:t xml:space="preserve">(Right-click the table above and select “Update Field” → “Update entire table” in Microsoft Word to populate page numbers after any further edits.)</w:t>
-      </w:r>
-    </w:p>
-    <w:p>
-      <w:pPr>
         <w:pStyle w:val="Heading1"/>
         <w:pageBreakBefore/>
         <w:spacing w:after="360" w:before="0" w:line="360"/>
@@ -1435,20 +1317,6 @@
           <w:sz w:val="24"/>
           <w:szCs w:val="24"/>
         </w:rPr>
-        <w:t xml:space="preserve">Figure 6.4:  O/C on unseen biomass (Test 2): raw inputs vs. physics inputs</w:t>
-      </w:r>
-    </w:p>
-    <w:p>
-      <w:pPr>
-        <w:spacing w:after="100" w:before="0" w:line="360"/>
-        <w:jc w:val="left"/>
-      </w:pPr>
-      <w:r>
-        <w:rPr>
-          <w:rFonts w:ascii="Times New Roman" w:cs="Times New Roman" w:eastAsia="Times New Roman" w:hAnsi="Times New Roman"/>
-          <w:sz w:val="24"/>
-          <w:szCs w:val="24"/>
-        </w:rPr>
         <w:t xml:space="preserve">Figure 7.1:  Average model response to temperature, with kinetic tar selectivity for comparison</w:t>
       </w:r>
     </w:p>
@@ -1607,7 +1475,21 @@
           <w:sz w:val="24"/>
           <w:szCs w:val="24"/>
         </w:rPr>
-        <w:t xml:space="preserve">Table 6.1:  Accuracy of each model under Test 1 (random split) and Test 2 (unseen biomass)</w:t>
+        <w:t xml:space="preserve">Table 6.1:  Main results at a glance: the three headline R² values</w:t>
+      </w:r>
+    </w:p>
+    <w:p>
+      <w:pPr>
+        <w:spacing w:after="100" w:before="0" w:line="360"/>
+        <w:jc w:val="left"/>
+      </w:pPr>
+      <w:r>
+        <w:rPr>
+          <w:rFonts w:ascii="Times New Roman" w:cs="Times New Roman" w:eastAsia="Times New Roman" w:hAnsi="Times New Roman"/>
+          <w:sz w:val="24"/>
+          <w:szCs w:val="24"/>
+        </w:rPr>
+        <w:t xml:space="preserve">Table 6.2:  Accuracy of each individual algorithm under Test 1 (random split) and Test 2 (unseen biomass)</w:t>
       </w:r>
     </w:p>
     <w:p>
@@ -6493,9 +6375,378 @@
           <w:sz w:val="24"/>
           <w:szCs w:val="24"/>
         </w:rPr>
-        <w:t xml:space="preserve">Accuracy is reported under the two protocols of Table 5.2: Test 1, the standard 80/20 random split used in the literature, and Test 2, a stricter check in which whole biomasses are held out of training.</w:t>
-      </w:r>
-    </w:p>
+        <w:t xml:space="preserve">Every R² in this report is fixed by three things: what is predicted (O/C or yield), which model, and which test (Table 5.2). Test 1 is the standard 80/20 random split used in the literature; Test 2 is a stricter check in which whole biomasses are held out of training. Table 6.1 gives the three headline results; the other values in this chapter compare individual algorithms along the way (Table 6.2).</w:t>
+      </w:r>
+    </w:p>
+    <w:p>
+      <w:pPr>
+        <w:spacing w:after="300" w:before="100" w:line="276"/>
+        <w:jc w:val="center"/>
+      </w:pPr>
+      <w:r>
+        <w:rPr>
+          <w:rFonts w:ascii="Times New Roman" w:cs="Times New Roman" w:eastAsia="Times New Roman" w:hAnsi="Times New Roman"/>
+          <w:b/>
+          <w:bCs/>
+          <w:sz w:val="24"/>
+          <w:szCs w:val="24"/>
+        </w:rPr>
+        <w:t xml:space="preserve">Table 6.1: Main results at a glance: the three headline R² values</w:t>
+      </w:r>
+    </w:p>
+    <w:tbl>
+      <w:tblPr>
+        <w:tblW w:type="dxa" w:w="9000"/>
+        <w:tblBorders>
+          <w:top w:val="single" w:color="auto" w:sz="4"/>
+          <w:left w:val="single" w:color="auto" w:sz="4"/>
+          <w:bottom w:val="single" w:color="auto" w:sz="4"/>
+          <w:right w:val="single" w:color="auto" w:sz="4"/>
+          <w:insideH w:val="single" w:color="auto" w:sz="4"/>
+          <w:insideV w:val="single" w:color="auto" w:sz="4"/>
+        </w:tblBorders>
+      </w:tblPr>
+      <w:tblGrid>
+        <w:gridCol w:w="4600"/>
+        <w:gridCol w:w="2200"/>
+        <w:gridCol w:w="2200"/>
+      </w:tblGrid>
+      <w:tr>
+        <w:trPr>
+          <w:tblHeader/>
+        </w:trPr>
+        <w:tc>
+          <w:tcPr>
+            <w:tcW w:type="dxa" w:w="4600"/>
+            <w:shd w:fill="1F3864" w:color="auto" w:val="clear"/>
+            <w:tcMar>
+              <w:top w:type="dxa" w:w="80"/>
+              <w:left w:type="dxa" w:w="100"/>
+              <w:bottom w:type="dxa" w:w="80"/>
+              <w:right w:type="dxa" w:w="100"/>
+            </w:tcMar>
+            <w:vAlign w:val="center"/>
+          </w:tcPr>
+          <w:p>
+            <w:pPr>
+              <w:jc w:val="center"/>
+            </w:pPr>
+            <w:r>
+              <w:rPr>
+                <w:rFonts w:ascii="Times New Roman" w:cs="Times New Roman" w:eastAsia="Times New Roman" w:hAnsi="Times New Roman"/>
+                <w:b/>
+                <w:bCs/>
+                <w:color w:val="FFFFFF"/>
+                <w:sz w:val="20"/>
+                <w:szCs w:val="20"/>
+              </w:rPr>
+              <w:t xml:space="preserve">Result</w:t>
+            </w:r>
+          </w:p>
+        </w:tc>
+        <w:tc>
+          <w:tcPr>
+            <w:tcW w:type="dxa" w:w="2200"/>
+            <w:shd w:fill="1F3864" w:color="auto" w:val="clear"/>
+            <w:tcMar>
+              <w:top w:type="dxa" w:w="80"/>
+              <w:left w:type="dxa" w:w="100"/>
+              <w:bottom w:type="dxa" w:w="80"/>
+              <w:right w:type="dxa" w:w="100"/>
+            </w:tcMar>
+            <w:vAlign w:val="center"/>
+          </w:tcPr>
+          <w:p>
+            <w:pPr>
+              <w:jc w:val="center"/>
+            </w:pPr>
+            <w:r>
+              <w:rPr>
+                <w:rFonts w:ascii="Times New Roman" w:cs="Times New Roman" w:eastAsia="Times New Roman" w:hAnsi="Times New Roman"/>
+                <w:b/>
+                <w:bCs/>
+                <w:color w:val="FFFFFF"/>
+                <w:sz w:val="20"/>
+                <w:szCs w:val="20"/>
+              </w:rPr>
+              <w:t xml:space="preserve">Test 1: standard 80/20 split</w:t>
+            </w:r>
+          </w:p>
+        </w:tc>
+        <w:tc>
+          <w:tcPr>
+            <w:tcW w:type="dxa" w:w="2200"/>
+            <w:shd w:fill="1F3864" w:color="auto" w:val="clear"/>
+            <w:tcMar>
+              <w:top w:type="dxa" w:w="80"/>
+              <w:left w:type="dxa" w:w="100"/>
+              <w:bottom w:type="dxa" w:w="80"/>
+              <w:right w:type="dxa" w:w="100"/>
+            </w:tcMar>
+            <w:vAlign w:val="center"/>
+          </w:tcPr>
+          <w:p>
+            <w:pPr>
+              <w:jc w:val="center"/>
+            </w:pPr>
+            <w:r>
+              <w:rPr>
+                <w:rFonts w:ascii="Times New Roman" w:cs="Times New Roman" w:eastAsia="Times New Roman" w:hAnsi="Times New Roman"/>
+                <w:b/>
+                <w:bCs/>
+                <w:color w:val="FFFFFF"/>
+                <w:sz w:val="20"/>
+                <w:szCs w:val="20"/>
+              </w:rPr>
+              <w:t xml:space="preserve">Test 2: unseen biomass</w:t>
+            </w:r>
+          </w:p>
+        </w:tc>
+      </w:tr>
+      <w:tr>
+        <w:tc>
+          <w:tcPr>
+            <w:tcW w:type="dxa" w:w="4600"/>
+            <w:tcMar>
+              <w:top w:type="dxa" w:w="80"/>
+              <w:left w:type="dxa" w:w="100"/>
+              <w:bottom w:type="dxa" w:w="80"/>
+              <w:right w:type="dxa" w:w="100"/>
+            </w:tcMar>
+            <w:vAlign w:val="center"/>
+          </w:tcPr>
+          <w:p>
+            <w:pPr>
+              <w:jc w:val="left"/>
+            </w:pPr>
+            <w:r>
+              <w:rPr>
+                <w:rFonts w:ascii="Times New Roman" w:cs="Times New Roman" w:eastAsia="Times New Roman" w:hAnsi="Times New Roman"/>
+                <w:color w:val="000000"/>
+                <w:sz w:val="20"/>
+                <w:szCs w:val="20"/>
+              </w:rPr>
+              <w:t xml:space="preserve">O/C, best single model (XGBoost, 7-model benchmark)</w:t>
+            </w:r>
+          </w:p>
+        </w:tc>
+        <w:tc>
+          <w:tcPr>
+            <w:tcW w:type="dxa" w:w="2200"/>
+            <w:tcMar>
+              <w:top w:type="dxa" w:w="80"/>
+              <w:left w:type="dxa" w:w="100"/>
+              <w:bottom w:type="dxa" w:w="80"/>
+              <w:right w:type="dxa" w:w="100"/>
+            </w:tcMar>
+            <w:vAlign w:val="center"/>
+          </w:tcPr>
+          <w:p>
+            <w:pPr>
+              <w:jc w:val="center"/>
+            </w:pPr>
+            <w:r>
+              <w:rPr>
+                <w:rFonts w:ascii="Times New Roman" w:cs="Times New Roman" w:eastAsia="Times New Roman" w:hAnsi="Times New Roman"/>
+                <w:color w:val="000000"/>
+                <w:sz w:val="20"/>
+                <w:szCs w:val="20"/>
+              </w:rPr>
+              <w:t xml:space="preserve">0.90</w:t>
+            </w:r>
+          </w:p>
+        </w:tc>
+        <w:tc>
+          <w:tcPr>
+            <w:tcW w:type="dxa" w:w="2200"/>
+            <w:tcMar>
+              <w:top w:type="dxa" w:w="80"/>
+              <w:left w:type="dxa" w:w="100"/>
+              <w:bottom w:type="dxa" w:w="80"/>
+              <w:right w:type="dxa" w:w="100"/>
+            </w:tcMar>
+            <w:vAlign w:val="center"/>
+          </w:tcPr>
+          <w:p>
+            <w:pPr>
+              <w:jc w:val="center"/>
+            </w:pPr>
+            <w:r>
+              <w:rPr>
+                <w:rFonts w:ascii="Times New Roman" w:cs="Times New Roman" w:eastAsia="Times New Roman" w:hAnsi="Times New Roman"/>
+                <w:color w:val="000000"/>
+                <w:sz w:val="20"/>
+                <w:szCs w:val="20"/>
+              </w:rPr>
+              <w:t xml:space="preserve">not run</w:t>
+            </w:r>
+          </w:p>
+        </w:tc>
+      </w:tr>
+      <w:tr>
+        <w:tc>
+          <w:tcPr>
+            <w:tcW w:type="dxa" w:w="4600"/>
+            <w:shd w:fill="EDEDED" w:color="auto" w:val="clear"/>
+            <w:tcMar>
+              <w:top w:type="dxa" w:w="80"/>
+              <w:left w:type="dxa" w:w="100"/>
+              <w:bottom w:type="dxa" w:w="80"/>
+              <w:right w:type="dxa" w:w="100"/>
+            </w:tcMar>
+            <w:vAlign w:val="center"/>
+          </w:tcPr>
+          <w:p>
+            <w:pPr>
+              <w:jc w:val="left"/>
+            </w:pPr>
+            <w:r>
+              <w:rPr>
+                <w:rFonts w:ascii="Times New Roman" w:cs="Times New Roman" w:eastAsia="Times New Roman" w:hAnsi="Times New Roman"/>
+                <w:color w:val="000000"/>
+                <w:sz w:val="20"/>
+                <w:szCs w:val="20"/>
+              </w:rPr>
+              <w:t xml:space="preserve">O/C, final Advisor model (log scale)</w:t>
+            </w:r>
+          </w:p>
+        </w:tc>
+        <w:tc>
+          <w:tcPr>
+            <w:tcW w:type="dxa" w:w="2200"/>
+            <w:shd w:fill="EDEDED" w:color="auto" w:val="clear"/>
+            <w:tcMar>
+              <w:top w:type="dxa" w:w="80"/>
+              <w:left w:type="dxa" w:w="100"/>
+              <w:bottom w:type="dxa" w:w="80"/>
+              <w:right w:type="dxa" w:w="100"/>
+            </w:tcMar>
+            <w:vAlign w:val="center"/>
+          </w:tcPr>
+          <w:p>
+            <w:pPr>
+              <w:jc w:val="center"/>
+            </w:pPr>
+            <w:r>
+              <w:rPr>
+                <w:rFonts w:ascii="Times New Roman" w:cs="Times New Roman" w:eastAsia="Times New Roman" w:hAnsi="Times New Roman"/>
+                <w:color w:val="000000"/>
+                <w:sz w:val="20"/>
+                <w:szCs w:val="20"/>
+              </w:rPr>
+              <w:t xml:space="preserve">0.61</w:t>
+            </w:r>
+          </w:p>
+        </w:tc>
+        <w:tc>
+          <w:tcPr>
+            <w:tcW w:type="dxa" w:w="2200"/>
+            <w:shd w:fill="EDEDED" w:color="auto" w:val="clear"/>
+            <w:tcMar>
+              <w:top w:type="dxa" w:w="80"/>
+              <w:left w:type="dxa" w:w="100"/>
+              <w:bottom w:type="dxa" w:w="80"/>
+              <w:right w:type="dxa" w:w="100"/>
+            </w:tcMar>
+            <w:vAlign w:val="center"/>
+          </w:tcPr>
+          <w:p>
+            <w:pPr>
+              <w:jc w:val="center"/>
+            </w:pPr>
+            <w:r>
+              <w:rPr>
+                <w:rFonts w:ascii="Times New Roman" w:cs="Times New Roman" w:eastAsia="Times New Roman" w:hAnsi="Times New Roman"/>
+                <w:color w:val="000000"/>
+                <w:sz w:val="20"/>
+                <w:szCs w:val="20"/>
+              </w:rPr>
+              <w:t xml:space="preserve">0.27</w:t>
+            </w:r>
+          </w:p>
+        </w:tc>
+      </w:tr>
+      <w:tr>
+        <w:tc>
+          <w:tcPr>
+            <w:tcW w:type="dxa" w:w="4600"/>
+            <w:tcMar>
+              <w:top w:type="dxa" w:w="80"/>
+              <w:left w:type="dxa" w:w="100"/>
+              <w:bottom w:type="dxa" w:w="80"/>
+              <w:right w:type="dxa" w:w="100"/>
+            </w:tcMar>
+            <w:vAlign w:val="center"/>
+          </w:tcPr>
+          <w:p>
+            <w:pPr>
+              <w:jc w:val="left"/>
+            </w:pPr>
+            <w:r>
+              <w:rPr>
+                <w:rFonts w:ascii="Times New Roman" w:cs="Times New Roman" w:eastAsia="Times New Roman" w:hAnsi="Times New Roman"/>
+                <w:color w:val="000000"/>
+                <w:sz w:val="20"/>
+                <w:szCs w:val="20"/>
+              </w:rPr>
+              <w:t xml:space="preserve">Yield, final Advisor model</w:t>
+            </w:r>
+          </w:p>
+        </w:tc>
+        <w:tc>
+          <w:tcPr>
+            <w:tcW w:type="dxa" w:w="2200"/>
+            <w:tcMar>
+              <w:top w:type="dxa" w:w="80"/>
+              <w:left w:type="dxa" w:w="100"/>
+              <w:bottom w:type="dxa" w:w="80"/>
+              <w:right w:type="dxa" w:w="100"/>
+            </w:tcMar>
+            <w:vAlign w:val="center"/>
+          </w:tcPr>
+          <w:p>
+            <w:pPr>
+              <w:jc w:val="center"/>
+            </w:pPr>
+            <w:r>
+              <w:rPr>
+                <w:rFonts w:ascii="Times New Roman" w:cs="Times New Roman" w:eastAsia="Times New Roman" w:hAnsi="Times New Roman"/>
+                <w:color w:val="000000"/>
+                <w:sz w:val="20"/>
+                <w:szCs w:val="20"/>
+              </w:rPr>
+              <w:t xml:space="preserve">0.61</w:t>
+            </w:r>
+          </w:p>
+        </w:tc>
+        <w:tc>
+          <w:tcPr>
+            <w:tcW w:type="dxa" w:w="2200"/>
+            <w:tcMar>
+              <w:top w:type="dxa" w:w="80"/>
+              <w:left w:type="dxa" w:w="100"/>
+              <w:bottom w:type="dxa" w:w="80"/>
+              <w:right w:type="dxa" w:w="100"/>
+            </w:tcMar>
+            <w:vAlign w:val="center"/>
+          </w:tcPr>
+          <w:p>
+            <w:pPr>
+              <w:jc w:val="center"/>
+            </w:pPr>
+            <w:r>
+              <w:rPr>
+                <w:rFonts w:ascii="Times New Roman" w:cs="Times New Roman" w:eastAsia="Times New Roman" w:hAnsi="Times New Roman"/>
+                <w:color w:val="000000"/>
+                <w:sz w:val="20"/>
+                <w:szCs w:val="20"/>
+              </w:rPr>
+              <w:t xml:space="preserve">0.07</w:t>
+            </w:r>
+          </w:p>
+        </w:tc>
+      </w:tr>
+    </w:tbl>
     <w:p>
       <w:pPr>
         <w:pStyle w:val="Heading2"/>
@@ -6535,7 +6786,7 @@
       <w:r>
         <w:drawing>
           <wp:inline distT="0" distB="0" distL="0" distR="0">
-            <wp:extent cx="4476750" cy="2352675"/>
+            <wp:extent cx="4114800" cy="2162175"/>
             <wp:effectExtent t="0" r="0" b="0" l="0"/>
             <wp:docPr id="1" name="" descr="" title=""/>
             <wp:cNvGraphicFramePr>
@@ -6560,7 +6811,7 @@
                   <pic:spPr bwMode="auto">
                     <a:xfrm>
                       <a:off x="0" y="0"/>
-                      <a:ext cx="4476750" cy="2352675"/>
+                      <a:ext cx="4114800" cy="2162175"/>
                     </a:xfrm>
                     <a:prstGeom prst="rect">
                       <a:avLst/>
@@ -6600,7 +6851,7 @@
           <w:sz w:val="24"/>
           <w:szCs w:val="24"/>
         </w:rPr>
-        <w:t xml:space="preserve">Averaged over ten random 80/20 splits, yield models reached R² = 0.69 (Random Forest, MAE 3.8 wt%), 0.66 (XGBoost) and 0.60 (GPR). The final Advisor models of Chapter 7 averaged R² = 0.61 for O/C (log scale; best split 0.85, typical error 18%) and 0.61 for yield (best split 0.67, MAE 4.2 wt%). Figure 6.2 shows their predictions against measured values.</w:t>
+        <w:t xml:space="preserve">Averaged over ten random 80/20 splits, yield models reached R² = 0.69 (Random Forest, MAE 3.8 wt%), 0.66 (XGBoost) and 0.60 (GPR). The final Advisor models of Chapter 7 averaged R² = 0.61 for O/C (log scale; best split 0.85, typical error 18%) and 0.61 for yield (best split 0.67, MAE 4.2 wt%). The two O/C values differ for three reasons: 0.90 is the best of seven models on one held-out split of the original 232-row data with O/C on its natural scale, whereas 0.61 is the physics-constrained Advisor model averaged over ten splits of the cleaned 223-row data on a log scale, where low-O/C samples count as much as high ones. Figure 6.2 shows the Advisor model's predictions against measured values.</w:t>
       </w:r>
     </w:p>
     <w:p>
@@ -6611,7 +6862,7 @@
       <w:r>
         <w:drawing>
           <wp:inline distT="0" distB="0" distL="0" distR="0">
-            <wp:extent cx="4933950" cy="2152650"/>
+            <wp:extent cx="4572000" cy="1990725"/>
             <wp:effectExtent t="0" r="0" b="0" l="0"/>
             <wp:docPr id="1" name="" descr="" title=""/>
             <wp:cNvGraphicFramePr>
@@ -6636,7 +6887,7 @@
                   <pic:spPr bwMode="auto">
                     <a:xfrm>
                       <a:off x="0" y="0"/>
-                      <a:ext cx="4933950" cy="2152650"/>
+                      <a:ext cx="4572000" cy="1990725"/>
                     </a:xfrm>
                     <a:prstGeom prst="rect">
                       <a:avLst/>
@@ -6678,7 +6929,7 @@
           <w:sz w:val="24"/>
           <w:szCs w:val="24"/>
         </w:rPr>
-        <w:t xml:space="preserve">Table 6.1: Accuracy of each model under Test 1 (random split) and Test 2 (unseen biomass), physics-informed features</w:t>
+        <w:t xml:space="preserve">Table 6.2: Accuracy of each individual algorithm under Test 1 (random split) and Test 2 (unseen biomass), physics-informed features</w:t>
       </w:r>
     </w:p>
     <w:tbl>
@@ -8855,7 +9106,1042 @@
           <w:sz w:val="24"/>
           <w:szCs w:val="24"/>
         </w:rPr>
-        <w:t xml:space="preserve">Physics-informed features raised O/C accuracy for every model in both tests. Under Test 1, GPR rose from R² = 0.43 (raw inputs) to 0.63, Random Forest from 0.45 to 0.52 and XGBoost from 0.44 to 0.51. Under Test 2 the relative gain is larger: GPR rose from −0.14 to 0.23 (Figure 6.4), supporting Pascarella et al.'s (2025) recommendation of physics-informed approaches for sparse compiled data.</w:t>
+        <w:t xml:space="preserve">Physics-informed features raised O/C accuracy for every model in both tests. Under Test 1, GPR rose from R² = 0.43 (raw inputs) to 0.63, Random Forest from 0.45 to 0.52 and XGBoost from 0.44 to 0.51. Under Test 2 the relative gain is larger: GPR rose from −0.14 to 0.23, supporting Pascarella et al.'s (2025) recommendation of physics-informed approaches for sparse compiled data.</w:t>
+      </w:r>
+    </w:p>
+    <w:p>
+      <w:pPr>
+        <w:sectPr>
+          <w:headerReference w:type="default" r:id="rId23"/>
+          <w:footerReference w:type="default" r:id="rId24"/>
+          <w:pgSz w:w="11906" w:h="16838" w:orient="portrait"/>
+          <w:pgMar w:top="1984" w:right="1701" w:bottom="1701" w:left="2268" w:header="708" w:footer="708" w:gutter="0"/>
+          <w:pgNumType w:fmt="decimal"/>
+          <w:docGrid w:linePitch="360"/>
+        </w:sectPr>
+      </w:pPr>
+    </w:p>
+    <w:p>
+      <w:pPr>
+        <w:pStyle w:val="Heading1"/>
+        <w:pageBreakBefore/>
+        <w:spacing w:after="360" w:before="0" w:line="360"/>
+      </w:pPr>
+      <w:r>
+        <w:rPr>
+          <w:rFonts w:ascii="Times New Roman" w:cs="Times New Roman" w:eastAsia="Times New Roman" w:hAnsi="Times New Roman"/>
+          <w:b/>
+          <w:bCs/>
+          <w:color w:val="1F3864"/>
+          <w:sz w:val="32"/>
+          <w:szCs w:val="32"/>
+        </w:rPr>
+        <w:t xml:space="preserve">CHAPTER 7: RESULTS — PART B: PHYSICS-AWARE MODELS AND THE ADVISOR</w:t>
+      </w:r>
+    </w:p>
+    <w:p>
+      <w:pPr>
+        <w:pStyle w:val="Heading2"/>
+        <w:spacing w:after="200" w:before="300" w:line="360"/>
+      </w:pPr>
+      <w:r>
+        <w:rPr>
+          <w:rFonts w:ascii="Times New Roman" w:cs="Times New Roman" w:eastAsia="Times New Roman" w:hAnsi="Times New Roman"/>
+          <w:b/>
+          <w:bCs/>
+          <w:color w:val="1F3864"/>
+          <w:sz w:val="28"/>
+          <w:szCs w:val="28"/>
+        </w:rPr>
+        <w:t xml:space="preserve">7.1 Final Model Selection</w:t>
+      </w:r>
+    </w:p>
+    <w:p>
+      <w:pPr>
+        <w:spacing w:after="200" w:before="0" w:line="360"/>
+        <w:jc w:val="both"/>
+      </w:pPr>
+      <w:r>
+        <w:rPr>
+          <w:rFonts w:ascii="Times New Roman" w:cs="Times New Roman" w:eastAsia="Times New Roman" w:hAnsi="Times New Roman"/>
+          <w:sz w:val="24"/>
+          <w:szCs w:val="24"/>
+        </w:rPr>
+        <w:t xml:space="preserve">Final models were selected on Test 2 (grouped by biomass), the setting that matters when the Advisor meets a new feedstock; on Test 1 the selected models score R² ≈ 0.61 for both targets (Section 6.1). Table 7.1 compares yield candidates. “Shape R²” measures how well a model captures the within-biomass response to conditions — what the Advisor needs. A plain GPR achieves shape R²≈0.01 (ignores conditions); level-plus-shape was selected for its shape R² = 0.12.</w:t>
+      </w:r>
+    </w:p>
+    <w:p>
+      <w:pPr>
+        <w:spacing w:after="300" w:before="100" w:line="276"/>
+        <w:jc w:val="center"/>
+      </w:pPr>
+      <w:r>
+        <w:rPr>
+          <w:rFonts w:ascii="Times New Roman" w:cs="Times New Roman" w:eastAsia="Times New Roman" w:hAnsi="Times New Roman"/>
+          <w:b/>
+          <w:bCs/>
+          <w:sz w:val="24"/>
+          <w:szCs w:val="24"/>
+        </w:rPr>
+        <w:t xml:space="preserve">Table 7.1: Final yield model selection (Test 2, grouped by biomass)</w:t>
+      </w:r>
+    </w:p>
+    <w:tbl>
+      <w:tblPr>
+        <w:tblW w:type="dxa" w:w="8600"/>
+        <w:tblBorders>
+          <w:top w:val="single" w:color="auto" w:sz="4"/>
+          <w:left w:val="single" w:color="auto" w:sz="4"/>
+          <w:bottom w:val="single" w:color="auto" w:sz="4"/>
+          <w:right w:val="single" w:color="auto" w:sz="4"/>
+          <w:insideH w:val="single" w:color="auto" w:sz="4"/>
+          <w:insideV w:val="single" w:color="auto" w:sz="4"/>
+        </w:tblBorders>
+      </w:tblPr>
+      <w:tblGrid>
+        <w:gridCol w:w="3600"/>
+        <w:gridCol w:w="1600"/>
+        <w:gridCol w:w="1600"/>
+        <w:gridCol w:w="1800"/>
+      </w:tblGrid>
+      <w:tr>
+        <w:trPr>
+          <w:tblHeader/>
+        </w:trPr>
+        <w:tc>
+          <w:tcPr>
+            <w:tcW w:type="dxa" w:w="3600"/>
+            <w:shd w:fill="1F3864" w:color="auto" w:val="clear"/>
+            <w:tcMar>
+              <w:top w:type="dxa" w:w="80"/>
+              <w:left w:type="dxa" w:w="100"/>
+              <w:bottom w:type="dxa" w:w="80"/>
+              <w:right w:type="dxa" w:w="100"/>
+            </w:tcMar>
+            <w:vAlign w:val="center"/>
+          </w:tcPr>
+          <w:p>
+            <w:pPr>
+              <w:jc w:val="center"/>
+            </w:pPr>
+            <w:r>
+              <w:rPr>
+                <w:rFonts w:ascii="Times New Roman" w:cs="Times New Roman" w:eastAsia="Times New Roman" w:hAnsi="Times New Roman"/>
+                <w:b/>
+                <w:bCs/>
+                <w:color w:val="FFFFFF"/>
+                <w:sz w:val="20"/>
+                <w:szCs w:val="20"/>
+              </w:rPr>
+              <w:t xml:space="preserve">Model</w:t>
+            </w:r>
+          </w:p>
+        </w:tc>
+        <w:tc>
+          <w:tcPr>
+            <w:tcW w:type="dxa" w:w="1600"/>
+            <w:shd w:fill="1F3864" w:color="auto" w:val="clear"/>
+            <w:tcMar>
+              <w:top w:type="dxa" w:w="80"/>
+              <w:left w:type="dxa" w:w="100"/>
+              <w:bottom w:type="dxa" w:w="80"/>
+              <w:right w:type="dxa" w:w="100"/>
+            </w:tcMar>
+            <w:vAlign w:val="center"/>
+          </w:tcPr>
+          <w:p>
+            <w:pPr>
+              <w:jc w:val="center"/>
+            </w:pPr>
+            <w:r>
+              <w:rPr>
+                <w:rFonts w:ascii="Times New Roman" w:cs="Times New Roman" w:eastAsia="Times New Roman" w:hAnsi="Times New Roman"/>
+                <w:b/>
+                <w:bCs/>
+                <w:color w:val="FFFFFF"/>
+                <w:sz w:val="20"/>
+                <w:szCs w:val="20"/>
+              </w:rPr>
+              <w:t xml:space="preserve">R²</w:t>
+            </w:r>
+          </w:p>
+        </w:tc>
+        <w:tc>
+          <w:tcPr>
+            <w:tcW w:type="dxa" w:w="1600"/>
+            <w:shd w:fill="1F3864" w:color="auto" w:val="clear"/>
+            <w:tcMar>
+              <w:top w:type="dxa" w:w="80"/>
+              <w:left w:type="dxa" w:w="100"/>
+              <w:bottom w:type="dxa" w:w="80"/>
+              <w:right w:type="dxa" w:w="100"/>
+            </w:tcMar>
+            <w:vAlign w:val="center"/>
+          </w:tcPr>
+          <w:p>
+            <w:pPr>
+              <w:jc w:val="center"/>
+            </w:pPr>
+            <w:r>
+              <w:rPr>
+                <w:rFonts w:ascii="Times New Roman" w:cs="Times New Roman" w:eastAsia="Times New Roman" w:hAnsi="Times New Roman"/>
+                <w:b/>
+                <w:bCs/>
+                <w:color w:val="FFFFFF"/>
+                <w:sz w:val="20"/>
+                <w:szCs w:val="20"/>
+              </w:rPr>
+              <w:t xml:space="preserve">MAE (wt%)</w:t>
+            </w:r>
+          </w:p>
+        </w:tc>
+        <w:tc>
+          <w:tcPr>
+            <w:tcW w:type="dxa" w:w="1800"/>
+            <w:shd w:fill="1F3864" w:color="auto" w:val="clear"/>
+            <w:tcMar>
+              <w:top w:type="dxa" w:w="80"/>
+              <w:left w:type="dxa" w:w="100"/>
+              <w:bottom w:type="dxa" w:w="80"/>
+              <w:right w:type="dxa" w:w="100"/>
+            </w:tcMar>
+            <w:vAlign w:val="center"/>
+          </w:tcPr>
+          <w:p>
+            <w:pPr>
+              <w:jc w:val="center"/>
+            </w:pPr>
+            <w:r>
+              <w:rPr>
+                <w:rFonts w:ascii="Times New Roman" w:cs="Times New Roman" w:eastAsia="Times New Roman" w:hAnsi="Times New Roman"/>
+                <w:b/>
+                <w:bCs/>
+                <w:color w:val="FFFFFF"/>
+                <w:sz w:val="20"/>
+                <w:szCs w:val="20"/>
+              </w:rPr>
+              <w:t xml:space="preserve">Shape R²</w:t>
+            </w:r>
+          </w:p>
+        </w:tc>
+      </w:tr>
+      <w:tr>
+        <w:tc>
+          <w:tcPr>
+            <w:tcW w:type="dxa" w:w="3600"/>
+            <w:tcMar>
+              <w:top w:type="dxa" w:w="80"/>
+              <w:left w:type="dxa" w:w="100"/>
+              <w:bottom w:type="dxa" w:w="80"/>
+              <w:right w:type="dxa" w:w="100"/>
+            </w:tcMar>
+            <w:vAlign w:val="center"/>
+          </w:tcPr>
+          <w:p>
+            <w:pPr>
+              <w:jc w:val="left"/>
+            </w:pPr>
+            <w:r>
+              <w:rPr>
+                <w:rFonts w:ascii="Times New Roman" w:cs="Times New Roman" w:eastAsia="Times New Roman" w:hAnsi="Times New Roman"/>
+                <w:color w:val="000000"/>
+                <w:sz w:val="20"/>
+                <w:szCs w:val="20"/>
+              </w:rPr>
+              <w:t xml:space="preserve">Mean only</w:t>
+            </w:r>
+          </w:p>
+        </w:tc>
+        <w:tc>
+          <w:tcPr>
+            <w:tcW w:type="dxa" w:w="1600"/>
+            <w:tcMar>
+              <w:top w:type="dxa" w:w="80"/>
+              <w:left w:type="dxa" w:w="100"/>
+              <w:bottom w:type="dxa" w:w="80"/>
+              <w:right w:type="dxa" w:w="100"/>
+            </w:tcMar>
+            <w:vAlign w:val="center"/>
+          </w:tcPr>
+          <w:p>
+            <w:pPr>
+              <w:jc w:val="center"/>
+            </w:pPr>
+            <w:r>
+              <w:rPr>
+                <w:rFonts w:ascii="Times New Roman" w:cs="Times New Roman" w:eastAsia="Times New Roman" w:hAnsi="Times New Roman"/>
+                <w:color w:val="000000"/>
+                <w:sz w:val="20"/>
+                <w:szCs w:val="20"/>
+              </w:rPr>
+              <w:t xml:space="preserve">−0.09</w:t>
+            </w:r>
+          </w:p>
+        </w:tc>
+        <w:tc>
+          <w:tcPr>
+            <w:tcW w:type="dxa" w:w="1600"/>
+            <w:tcMar>
+              <w:top w:type="dxa" w:w="80"/>
+              <w:left w:type="dxa" w:w="100"/>
+              <w:bottom w:type="dxa" w:w="80"/>
+              <w:right w:type="dxa" w:w="100"/>
+            </w:tcMar>
+            <w:vAlign w:val="center"/>
+          </w:tcPr>
+          <w:p>
+            <w:pPr>
+              <w:jc w:val="center"/>
+            </w:pPr>
+            <w:r>
+              <w:rPr>
+                <w:rFonts w:ascii="Times New Roman" w:cs="Times New Roman" w:eastAsia="Times New Roman" w:hAnsi="Times New Roman"/>
+                <w:color w:val="000000"/>
+                <w:sz w:val="20"/>
+                <w:szCs w:val="20"/>
+              </w:rPr>
+              <w:t xml:space="preserve">8.21</w:t>
+            </w:r>
+          </w:p>
+        </w:tc>
+        <w:tc>
+          <w:tcPr>
+            <w:tcW w:type="dxa" w:w="1800"/>
+            <w:tcMar>
+              <w:top w:type="dxa" w:w="80"/>
+              <w:left w:type="dxa" w:w="100"/>
+              <w:bottom w:type="dxa" w:w="80"/>
+              <w:right w:type="dxa" w:w="100"/>
+            </w:tcMar>
+            <w:vAlign w:val="center"/>
+          </w:tcPr>
+          <w:p>
+            <w:pPr>
+              <w:jc w:val="center"/>
+            </w:pPr>
+            <w:r>
+              <w:rPr>
+                <w:rFonts w:ascii="Times New Roman" w:cs="Times New Roman" w:eastAsia="Times New Roman" w:hAnsi="Times New Roman"/>
+                <w:color w:val="000000"/>
+                <w:sz w:val="20"/>
+                <w:szCs w:val="20"/>
+              </w:rPr>
+              <w:t xml:space="preserve">0</w:t>
+            </w:r>
+          </w:p>
+        </w:tc>
+      </w:tr>
+      <w:tr>
+        <w:tc>
+          <w:tcPr>
+            <w:tcW w:type="dxa" w:w="3600"/>
+            <w:shd w:fill="EDEDED" w:color="auto" w:val="clear"/>
+            <w:tcMar>
+              <w:top w:type="dxa" w:w="80"/>
+              <w:left w:type="dxa" w:w="100"/>
+              <w:bottom w:type="dxa" w:w="80"/>
+              <w:right w:type="dxa" w:w="100"/>
+            </w:tcMar>
+            <w:vAlign w:val="center"/>
+          </w:tcPr>
+          <w:p>
+            <w:pPr>
+              <w:jc w:val="left"/>
+            </w:pPr>
+            <w:r>
+              <w:rPr>
+                <w:rFonts w:ascii="Times New Roman" w:cs="Times New Roman" w:eastAsia="Times New Roman" w:hAnsi="Times New Roman"/>
+                <w:color w:val="000000"/>
+                <w:sz w:val="20"/>
+                <w:szCs w:val="20"/>
+              </w:rPr>
+              <w:t xml:space="preserve">GPR only</w:t>
+            </w:r>
+          </w:p>
+        </w:tc>
+        <w:tc>
+          <w:tcPr>
+            <w:tcW w:type="dxa" w:w="1600"/>
+            <w:shd w:fill="EDEDED" w:color="auto" w:val="clear"/>
+            <w:tcMar>
+              <w:top w:type="dxa" w:w="80"/>
+              <w:left w:type="dxa" w:w="100"/>
+              <w:bottom w:type="dxa" w:w="80"/>
+              <w:right w:type="dxa" w:w="100"/>
+            </w:tcMar>
+            <w:vAlign w:val="center"/>
+          </w:tcPr>
+          <w:p>
+            <w:pPr>
+              <w:jc w:val="center"/>
+            </w:pPr>
+            <w:r>
+              <w:rPr>
+                <w:rFonts w:ascii="Times New Roman" w:cs="Times New Roman" w:eastAsia="Times New Roman" w:hAnsi="Times New Roman"/>
+                <w:color w:val="000000"/>
+                <w:sz w:val="20"/>
+                <w:szCs w:val="20"/>
+              </w:rPr>
+              <w:t xml:space="preserve">0.01</w:t>
+            </w:r>
+          </w:p>
+        </w:tc>
+        <w:tc>
+          <w:tcPr>
+            <w:tcW w:type="dxa" w:w="1600"/>
+            <w:shd w:fill="EDEDED" w:color="auto" w:val="clear"/>
+            <w:tcMar>
+              <w:top w:type="dxa" w:w="80"/>
+              <w:left w:type="dxa" w:w="100"/>
+              <w:bottom w:type="dxa" w:w="80"/>
+              <w:right w:type="dxa" w:w="100"/>
+            </w:tcMar>
+            <w:vAlign w:val="center"/>
+          </w:tcPr>
+          <w:p>
+            <w:pPr>
+              <w:jc w:val="center"/>
+            </w:pPr>
+            <w:r>
+              <w:rPr>
+                <w:rFonts w:ascii="Times New Roman" w:cs="Times New Roman" w:eastAsia="Times New Roman" w:hAnsi="Times New Roman"/>
+                <w:color w:val="000000"/>
+                <w:sz w:val="20"/>
+                <w:szCs w:val="20"/>
+              </w:rPr>
+              <w:t xml:space="preserve">7.70</w:t>
+            </w:r>
+          </w:p>
+        </w:tc>
+        <w:tc>
+          <w:tcPr>
+            <w:tcW w:type="dxa" w:w="1800"/>
+            <w:shd w:fill="EDEDED" w:color="auto" w:val="clear"/>
+            <w:tcMar>
+              <w:top w:type="dxa" w:w="80"/>
+              <w:left w:type="dxa" w:w="100"/>
+              <w:bottom w:type="dxa" w:w="80"/>
+              <w:right w:type="dxa" w:w="100"/>
+            </w:tcMar>
+            <w:vAlign w:val="center"/>
+          </w:tcPr>
+          <w:p>
+            <w:pPr>
+              <w:jc w:val="center"/>
+            </w:pPr>
+            <w:r>
+              <w:rPr>
+                <w:rFonts w:ascii="Times New Roman" w:cs="Times New Roman" w:eastAsia="Times New Roman" w:hAnsi="Times New Roman"/>
+                <w:color w:val="000000"/>
+                <w:sz w:val="20"/>
+                <w:szCs w:val="20"/>
+              </w:rPr>
+              <w:t xml:space="preserve">0.01</w:t>
+            </w:r>
+          </w:p>
+        </w:tc>
+      </w:tr>
+      <w:tr>
+        <w:tc>
+          <w:tcPr>
+            <w:tcW w:type="dxa" w:w="3600"/>
+            <w:tcMar>
+              <w:top w:type="dxa" w:w="80"/>
+              <w:left w:type="dxa" w:w="100"/>
+              <w:bottom w:type="dxa" w:w="80"/>
+              <w:right w:type="dxa" w:w="100"/>
+            </w:tcMar>
+            <w:vAlign w:val="center"/>
+          </w:tcPr>
+          <w:p>
+            <w:pPr>
+              <w:jc w:val="left"/>
+            </w:pPr>
+            <w:r>
+              <w:rPr>
+                <w:rFonts w:ascii="Times New Roman" w:cs="Times New Roman" w:eastAsia="Times New Roman" w:hAnsi="Times New Roman"/>
+                <w:color w:val="000000"/>
+                <w:sz w:val="20"/>
+                <w:szCs w:val="20"/>
+              </w:rPr>
+              <w:t xml:space="preserve">GPR + XGBoost average</w:t>
+            </w:r>
+          </w:p>
+        </w:tc>
+        <w:tc>
+          <w:tcPr>
+            <w:tcW w:type="dxa" w:w="1600"/>
+            <w:tcMar>
+              <w:top w:type="dxa" w:w="80"/>
+              <w:left w:type="dxa" w:w="100"/>
+              <w:bottom w:type="dxa" w:w="80"/>
+              <w:right w:type="dxa" w:w="100"/>
+            </w:tcMar>
+            <w:vAlign w:val="center"/>
+          </w:tcPr>
+          <w:p>
+            <w:pPr>
+              <w:jc w:val="center"/>
+            </w:pPr>
+            <w:r>
+              <w:rPr>
+                <w:rFonts w:ascii="Times New Roman" w:cs="Times New Roman" w:eastAsia="Times New Roman" w:hAnsi="Times New Roman"/>
+                <w:color w:val="000000"/>
+                <w:sz w:val="20"/>
+                <w:szCs w:val="20"/>
+              </w:rPr>
+              <w:t xml:space="preserve">0.07</w:t>
+            </w:r>
+          </w:p>
+        </w:tc>
+        <w:tc>
+          <w:tcPr>
+            <w:tcW w:type="dxa" w:w="1600"/>
+            <w:tcMar>
+              <w:top w:type="dxa" w:w="80"/>
+              <w:left w:type="dxa" w:w="100"/>
+              <w:bottom w:type="dxa" w:w="80"/>
+              <w:right w:type="dxa" w:w="100"/>
+            </w:tcMar>
+            <w:vAlign w:val="center"/>
+          </w:tcPr>
+          <w:p>
+            <w:pPr>
+              <w:jc w:val="center"/>
+            </w:pPr>
+            <w:r>
+              <w:rPr>
+                <w:rFonts w:ascii="Times New Roman" w:cs="Times New Roman" w:eastAsia="Times New Roman" w:hAnsi="Times New Roman"/>
+                <w:color w:val="000000"/>
+                <w:sz w:val="20"/>
+                <w:szCs w:val="20"/>
+              </w:rPr>
+              <w:t xml:space="preserve">7.48</w:t>
+            </w:r>
+          </w:p>
+        </w:tc>
+        <w:tc>
+          <w:tcPr>
+            <w:tcW w:type="dxa" w:w="1800"/>
+            <w:tcMar>
+              <w:top w:type="dxa" w:w="80"/>
+              <w:left w:type="dxa" w:w="100"/>
+              <w:bottom w:type="dxa" w:w="80"/>
+              <w:right w:type="dxa" w:w="100"/>
+            </w:tcMar>
+            <w:vAlign w:val="center"/>
+          </w:tcPr>
+          <w:p>
+            <w:pPr>
+              <w:jc w:val="center"/>
+            </w:pPr>
+            <w:r>
+              <w:rPr>
+                <w:rFonts w:ascii="Times New Roman" w:cs="Times New Roman" w:eastAsia="Times New Roman" w:hAnsi="Times New Roman"/>
+                <w:color w:val="000000"/>
+                <w:sz w:val="20"/>
+                <w:szCs w:val="20"/>
+              </w:rPr>
+              <w:t xml:space="preserve">0.07</w:t>
+            </w:r>
+          </w:p>
+        </w:tc>
+      </w:tr>
+      <w:tr>
+        <w:tc>
+          <w:tcPr>
+            <w:tcW w:type="dxa" w:w="3600"/>
+            <w:shd w:fill="EDEDED" w:color="auto" w:val="clear"/>
+            <w:tcMar>
+              <w:top w:type="dxa" w:w="80"/>
+              <w:left w:type="dxa" w:w="100"/>
+              <w:bottom w:type="dxa" w:w="80"/>
+              <w:right w:type="dxa" w:w="100"/>
+            </w:tcMar>
+            <w:vAlign w:val="center"/>
+          </w:tcPr>
+          <w:p>
+            <w:pPr>
+              <w:jc w:val="left"/>
+            </w:pPr>
+            <w:r>
+              <w:rPr>
+                <w:rFonts w:ascii="Times New Roman" w:cs="Times New Roman" w:eastAsia="Times New Roman" w:hAnsi="Times New Roman"/>
+                <w:color w:val="000000"/>
+                <w:sz w:val="20"/>
+                <w:szCs w:val="20"/>
+              </w:rPr>
+              <w:t xml:space="preserve">Level + shape — final</w:t>
+            </w:r>
+          </w:p>
+        </w:tc>
+        <w:tc>
+          <w:tcPr>
+            <w:tcW w:type="dxa" w:w="1600"/>
+            <w:shd w:fill="EDEDED" w:color="auto" w:val="clear"/>
+            <w:tcMar>
+              <w:top w:type="dxa" w:w="80"/>
+              <w:left w:type="dxa" w:w="100"/>
+              <w:bottom w:type="dxa" w:w="80"/>
+              <w:right w:type="dxa" w:w="100"/>
+            </w:tcMar>
+            <w:vAlign w:val="center"/>
+          </w:tcPr>
+          <w:p>
+            <w:pPr>
+              <w:jc w:val="center"/>
+            </w:pPr>
+            <w:r>
+              <w:rPr>
+                <w:rFonts w:ascii="Times New Roman" w:cs="Times New Roman" w:eastAsia="Times New Roman" w:hAnsi="Times New Roman"/>
+                <w:color w:val="000000"/>
+                <w:sz w:val="20"/>
+                <w:szCs w:val="20"/>
+              </w:rPr>
+              <w:t xml:space="preserve">0.07</w:t>
+            </w:r>
+          </w:p>
+        </w:tc>
+        <w:tc>
+          <w:tcPr>
+            <w:tcW w:type="dxa" w:w="1600"/>
+            <w:shd w:fill="EDEDED" w:color="auto" w:val="clear"/>
+            <w:tcMar>
+              <w:top w:type="dxa" w:w="80"/>
+              <w:left w:type="dxa" w:w="100"/>
+              <w:bottom w:type="dxa" w:w="80"/>
+              <w:right w:type="dxa" w:w="100"/>
+            </w:tcMar>
+            <w:vAlign w:val="center"/>
+          </w:tcPr>
+          <w:p>
+            <w:pPr>
+              <w:jc w:val="center"/>
+            </w:pPr>
+            <w:r>
+              <w:rPr>
+                <w:rFonts w:ascii="Times New Roman" w:cs="Times New Roman" w:eastAsia="Times New Roman" w:hAnsi="Times New Roman"/>
+                <w:color w:val="000000"/>
+                <w:sz w:val="20"/>
+                <w:szCs w:val="20"/>
+              </w:rPr>
+              <w:t xml:space="preserve">7.50</w:t>
+            </w:r>
+          </w:p>
+        </w:tc>
+        <w:tc>
+          <w:tcPr>
+            <w:tcW w:type="dxa" w:w="1800"/>
+            <w:shd w:fill="EDEDED" w:color="auto" w:val="clear"/>
+            <w:tcMar>
+              <w:top w:type="dxa" w:w="80"/>
+              <w:left w:type="dxa" w:w="100"/>
+              <w:bottom w:type="dxa" w:w="80"/>
+              <w:right w:type="dxa" w:w="100"/>
+            </w:tcMar>
+            <w:vAlign w:val="center"/>
+          </w:tcPr>
+          <w:p>
+            <w:pPr>
+              <w:jc w:val="center"/>
+            </w:pPr>
+            <w:r>
+              <w:rPr>
+                <w:rFonts w:ascii="Times New Roman" w:cs="Times New Roman" w:eastAsia="Times New Roman" w:hAnsi="Times New Roman"/>
+                <w:color w:val="000000"/>
+                <w:sz w:val="20"/>
+                <w:szCs w:val="20"/>
+              </w:rPr>
+              <w:t xml:space="preserve">0.12</w:t>
+            </w:r>
+          </w:p>
+        </w:tc>
+      </w:tr>
+    </w:tbl>
+    <w:p>
+      <w:pPr>
+        <w:spacing w:after="300" w:before="100" w:line="276"/>
+        <w:jc w:val="center"/>
+      </w:pPr>
+      <w:r>
+        <w:rPr>
+          <w:rFonts w:ascii="Times New Roman" w:cs="Times New Roman" w:eastAsia="Times New Roman" w:hAnsi="Times New Roman"/>
+          <w:b/>
+          <w:bCs/>
+          <w:sz w:val="24"/>
+          <w:szCs w:val="24"/>
+        </w:rPr>
+        <w:t xml:space="preserve">Table 7.2: Final O/C model selection (Test 2, grouped by biomass)</w:t>
+      </w:r>
+    </w:p>
+    <w:tbl>
+      <w:tblPr>
+        <w:tblW w:type="dxa" w:w="9600"/>
+        <w:tblBorders>
+          <w:top w:val="single" w:color="auto" w:sz="4"/>
+          <w:left w:val="single" w:color="auto" w:sz="4"/>
+          <w:bottom w:val="single" w:color="auto" w:sz="4"/>
+          <w:right w:val="single" w:color="auto" w:sz="4"/>
+          <w:insideH w:val="single" w:color="auto" w:sz="4"/>
+          <w:insideV w:val="single" w:color="auto" w:sz="4"/>
+        </w:tblBorders>
+      </w:tblPr>
+      <w:tblGrid>
+        <w:gridCol w:w="4200"/>
+        <w:gridCol w:w="2400"/>
+        <w:gridCol w:w="3000"/>
+      </w:tblGrid>
+      <w:tr>
+        <w:trPr>
+          <w:tblHeader/>
+        </w:trPr>
+        <w:tc>
+          <w:tcPr>
+            <w:tcW w:type="dxa" w:w="4200"/>
+            <w:shd w:fill="1F3864" w:color="auto" w:val="clear"/>
+            <w:tcMar>
+              <w:top w:type="dxa" w:w="80"/>
+              <w:left w:type="dxa" w:w="100"/>
+              <w:bottom w:type="dxa" w:w="80"/>
+              <w:right w:type="dxa" w:w="100"/>
+            </w:tcMar>
+            <w:vAlign w:val="center"/>
+          </w:tcPr>
+          <w:p>
+            <w:pPr>
+              <w:jc w:val="center"/>
+            </w:pPr>
+            <w:r>
+              <w:rPr>
+                <w:rFonts w:ascii="Times New Roman" w:cs="Times New Roman" w:eastAsia="Times New Roman" w:hAnsi="Times New Roman"/>
+                <w:b/>
+                <w:bCs/>
+                <w:color w:val="FFFFFF"/>
+                <w:sz w:val="20"/>
+                <w:szCs w:val="20"/>
+              </w:rPr>
+              <w:t xml:space="preserve">Model</w:t>
+            </w:r>
+          </w:p>
+        </w:tc>
+        <w:tc>
+          <w:tcPr>
+            <w:tcW w:type="dxa" w:w="2400"/>
+            <w:shd w:fill="1F3864" w:color="auto" w:val="clear"/>
+            <w:tcMar>
+              <w:top w:type="dxa" w:w="80"/>
+              <w:left w:type="dxa" w:w="100"/>
+              <w:bottom w:type="dxa" w:w="80"/>
+              <w:right w:type="dxa" w:w="100"/>
+            </w:tcMar>
+            <w:vAlign w:val="center"/>
+          </w:tcPr>
+          <w:p>
+            <w:pPr>
+              <w:jc w:val="center"/>
+            </w:pPr>
+            <w:r>
+              <w:rPr>
+                <w:rFonts w:ascii="Times New Roman" w:cs="Times New Roman" w:eastAsia="Times New Roman" w:hAnsi="Times New Roman"/>
+                <w:b/>
+                <w:bCs/>
+                <w:color w:val="FFFFFF"/>
+                <w:sz w:val="20"/>
+                <w:szCs w:val="20"/>
+              </w:rPr>
+              <w:t xml:space="preserve">R² (log)</w:t>
+            </w:r>
+          </w:p>
+        </w:tc>
+        <w:tc>
+          <w:tcPr>
+            <w:tcW w:type="dxa" w:w="3000"/>
+            <w:shd w:fill="1F3864" w:color="auto" w:val="clear"/>
+            <w:tcMar>
+              <w:top w:type="dxa" w:w="80"/>
+              <w:left w:type="dxa" w:w="100"/>
+              <w:bottom w:type="dxa" w:w="80"/>
+              <w:right w:type="dxa" w:w="100"/>
+            </w:tcMar>
+            <w:vAlign w:val="center"/>
+          </w:tcPr>
+          <w:p>
+            <w:pPr>
+              <w:jc w:val="center"/>
+            </w:pPr>
+            <w:r>
+              <w:rPr>
+                <w:rFonts w:ascii="Times New Roman" w:cs="Times New Roman" w:eastAsia="Times New Roman" w:hAnsi="Times New Roman"/>
+                <w:b/>
+                <w:bCs/>
+                <w:color w:val="FFFFFF"/>
+                <w:sz w:val="20"/>
+                <w:szCs w:val="20"/>
+              </w:rPr>
+              <w:t xml:space="preserve">Typical error (MedAPE)</w:t>
+            </w:r>
+          </w:p>
+        </w:tc>
+      </w:tr>
+      <w:tr>
+        <w:tc>
+          <w:tcPr>
+            <w:tcW w:type="dxa" w:w="4200"/>
+            <w:tcMar>
+              <w:top w:type="dxa" w:w="80"/>
+              <w:left w:type="dxa" w:w="100"/>
+              <w:bottom w:type="dxa" w:w="80"/>
+              <w:right w:type="dxa" w:w="100"/>
+            </w:tcMar>
+            <w:vAlign w:val="center"/>
+          </w:tcPr>
+          <w:p>
+            <w:pPr>
+              <w:jc w:val="left"/>
+            </w:pPr>
+            <w:r>
+              <w:rPr>
+                <w:rFonts w:ascii="Times New Roman" w:cs="Times New Roman" w:eastAsia="Times New Roman" w:hAnsi="Times New Roman"/>
+                <w:color w:val="000000"/>
+                <w:sz w:val="20"/>
+                <w:szCs w:val="20"/>
+              </w:rPr>
+              <w:t xml:space="preserve">GPR only</w:t>
+            </w:r>
+          </w:p>
+        </w:tc>
+        <w:tc>
+          <w:tcPr>
+            <w:tcW w:type="dxa" w:w="2400"/>
+            <w:tcMar>
+              <w:top w:type="dxa" w:w="80"/>
+              <w:left w:type="dxa" w:w="100"/>
+              <w:bottom w:type="dxa" w:w="80"/>
+              <w:right w:type="dxa" w:w="100"/>
+            </w:tcMar>
+            <w:vAlign w:val="center"/>
+          </w:tcPr>
+          <w:p>
+            <w:pPr>
+              <w:jc w:val="center"/>
+            </w:pPr>
+            <w:r>
+              <w:rPr>
+                <w:rFonts w:ascii="Times New Roman" w:cs="Times New Roman" w:eastAsia="Times New Roman" w:hAnsi="Times New Roman"/>
+                <w:color w:val="000000"/>
+                <w:sz w:val="20"/>
+                <w:szCs w:val="20"/>
+              </w:rPr>
+              <w:t xml:space="preserve">0.23 (log)</w:t>
+            </w:r>
+          </w:p>
+        </w:tc>
+        <w:tc>
+          <w:tcPr>
+            <w:tcW w:type="dxa" w:w="3000"/>
+            <w:tcMar>
+              <w:top w:type="dxa" w:w="80"/>
+              <w:left w:type="dxa" w:w="100"/>
+              <w:bottom w:type="dxa" w:w="80"/>
+              <w:right w:type="dxa" w:w="100"/>
+            </w:tcMar>
+            <w:vAlign w:val="center"/>
+          </w:tcPr>
+          <w:p>
+            <w:pPr>
+              <w:jc w:val="center"/>
+            </w:pPr>
+            <w:r>
+              <w:rPr>
+                <w:rFonts w:ascii="Times New Roman" w:cs="Times New Roman" w:eastAsia="Times New Roman" w:hAnsi="Times New Roman"/>
+                <w:color w:val="000000"/>
+                <w:sz w:val="20"/>
+                <w:szCs w:val="20"/>
+              </w:rPr>
+              <w:t xml:space="preserve">27.7% typical</w:t>
+            </w:r>
+          </w:p>
+        </w:tc>
+      </w:tr>
+      <w:tr>
+        <w:tc>
+          <w:tcPr>
+            <w:tcW w:type="dxa" w:w="4200"/>
+            <w:shd w:fill="EDEDED" w:color="auto" w:val="clear"/>
+            <w:tcMar>
+              <w:top w:type="dxa" w:w="80"/>
+              <w:left w:type="dxa" w:w="100"/>
+              <w:bottom w:type="dxa" w:w="80"/>
+              <w:right w:type="dxa" w:w="100"/>
+            </w:tcMar>
+            <w:vAlign w:val="center"/>
+          </w:tcPr>
+          <w:p>
+            <w:pPr>
+              <w:jc w:val="left"/>
+            </w:pPr>
+            <w:r>
+              <w:rPr>
+                <w:rFonts w:ascii="Times New Roman" w:cs="Times New Roman" w:eastAsia="Times New Roman" w:hAnsi="Times New Roman"/>
+                <w:color w:val="000000"/>
+                <w:sz w:val="20"/>
+                <w:szCs w:val="20"/>
+              </w:rPr>
+              <w:t xml:space="preserve">XGBoost, physics constraints</w:t>
+            </w:r>
+          </w:p>
+        </w:tc>
+        <w:tc>
+          <w:tcPr>
+            <w:tcW w:type="dxa" w:w="2400"/>
+            <w:shd w:fill="EDEDED" w:color="auto" w:val="clear"/>
+            <w:tcMar>
+              <w:top w:type="dxa" w:w="80"/>
+              <w:left w:type="dxa" w:w="100"/>
+              <w:bottom w:type="dxa" w:w="80"/>
+              <w:right w:type="dxa" w:w="100"/>
+            </w:tcMar>
+            <w:vAlign w:val="center"/>
+          </w:tcPr>
+          <w:p>
+            <w:pPr>
+              <w:jc w:val="center"/>
+            </w:pPr>
+            <w:r>
+              <w:rPr>
+                <w:rFonts w:ascii="Times New Roman" w:cs="Times New Roman" w:eastAsia="Times New Roman" w:hAnsi="Times New Roman"/>
+                <w:color w:val="000000"/>
+                <w:sz w:val="20"/>
+                <w:szCs w:val="20"/>
+              </w:rPr>
+              <w:t xml:space="preserve">0.14 (log)</w:t>
+            </w:r>
+          </w:p>
+        </w:tc>
+        <w:tc>
+          <w:tcPr>
+            <w:tcW w:type="dxa" w:w="3000"/>
+            <w:shd w:fill="EDEDED" w:color="auto" w:val="clear"/>
+            <w:tcMar>
+              <w:top w:type="dxa" w:w="80"/>
+              <w:left w:type="dxa" w:w="100"/>
+              <w:bottom w:type="dxa" w:w="80"/>
+              <w:right w:type="dxa" w:w="100"/>
+            </w:tcMar>
+            <w:vAlign w:val="center"/>
+          </w:tcPr>
+          <w:p>
+            <w:pPr>
+              <w:jc w:val="center"/>
+            </w:pPr>
+            <w:r>
+              <w:rPr>
+                <w:rFonts w:ascii="Times New Roman" w:cs="Times New Roman" w:eastAsia="Times New Roman" w:hAnsi="Times New Roman"/>
+                <w:color w:val="000000"/>
+                <w:sz w:val="20"/>
+                <w:szCs w:val="20"/>
+              </w:rPr>
+              <w:t xml:space="preserve">37.5% typical</w:t>
+            </w:r>
+          </w:p>
+        </w:tc>
+      </w:tr>
+      <w:tr>
+        <w:tc>
+          <w:tcPr>
+            <w:tcW w:type="dxa" w:w="4200"/>
+            <w:tcMar>
+              <w:top w:type="dxa" w:w="80"/>
+              <w:left w:type="dxa" w:w="100"/>
+              <w:bottom w:type="dxa" w:w="80"/>
+              <w:right w:type="dxa" w:w="100"/>
+            </w:tcMar>
+            <w:vAlign w:val="center"/>
+          </w:tcPr>
+          <w:p>
+            <w:pPr>
+              <w:jc w:val="left"/>
+            </w:pPr>
+            <w:r>
+              <w:rPr>
+                <w:rFonts w:ascii="Times New Roman" w:cs="Times New Roman" w:eastAsia="Times New Roman" w:hAnsi="Times New Roman"/>
+                <w:color w:val="000000"/>
+                <w:sz w:val="20"/>
+                <w:szCs w:val="20"/>
+              </w:rPr>
+              <w:t xml:space="preserve">Blend — final</w:t>
+            </w:r>
+          </w:p>
+        </w:tc>
+        <w:tc>
+          <w:tcPr>
+            <w:tcW w:type="dxa" w:w="2400"/>
+            <w:tcMar>
+              <w:top w:type="dxa" w:w="80"/>
+              <w:left w:type="dxa" w:w="100"/>
+              <w:bottom w:type="dxa" w:w="80"/>
+              <w:right w:type="dxa" w:w="100"/>
+            </w:tcMar>
+            <w:vAlign w:val="center"/>
+          </w:tcPr>
+          <w:p>
+            <w:pPr>
+              <w:jc w:val="center"/>
+            </w:pPr>
+            <w:r>
+              <w:rPr>
+                <w:rFonts w:ascii="Times New Roman" w:cs="Times New Roman" w:eastAsia="Times New Roman" w:hAnsi="Times New Roman"/>
+                <w:color w:val="000000"/>
+                <w:sz w:val="20"/>
+                <w:szCs w:val="20"/>
+              </w:rPr>
+              <w:t xml:space="preserve">0.26 (log)</w:t>
+            </w:r>
+          </w:p>
+        </w:tc>
+        <w:tc>
+          <w:tcPr>
+            <w:tcW w:type="dxa" w:w="3000"/>
+            <w:tcMar>
+              <w:top w:type="dxa" w:w="80"/>
+              <w:left w:type="dxa" w:w="100"/>
+              <w:bottom w:type="dxa" w:w="80"/>
+              <w:right w:type="dxa" w:w="100"/>
+            </w:tcMar>
+            <w:vAlign w:val="center"/>
+          </w:tcPr>
+          <w:p>
+            <w:pPr>
+              <w:jc w:val="center"/>
+            </w:pPr>
+            <w:r>
+              <w:rPr>
+                <w:rFonts w:ascii="Times New Roman" w:cs="Times New Roman" w:eastAsia="Times New Roman" w:hAnsi="Times New Roman"/>
+                <w:color w:val="000000"/>
+                <w:sz w:val="20"/>
+                <w:szCs w:val="20"/>
+              </w:rPr>
+              <w:t xml:space="preserve">32.1% typical</w:t>
+            </w:r>
+          </w:p>
+        </w:tc>
+      </w:tr>
+    </w:tbl>
+    <w:p>
+      <w:pPr>
+        <w:pStyle w:val="Heading2"/>
+        <w:spacing w:after="200" w:before="300" w:line="360"/>
+      </w:pPr>
+      <w:r>
+        <w:rPr>
+          <w:rFonts w:ascii="Times New Roman" w:cs="Times New Roman" w:eastAsia="Times New Roman" w:hAnsi="Times New Roman"/>
+          <w:b/>
+          <w:bCs/>
+          <w:color w:val="1F3864"/>
+          <w:sz w:val="28"/>
+          <w:szCs w:val="28"/>
+        </w:rPr>
+        <w:t xml:space="preserve">7.2 Physics Consistency Checks</w:t>
       </w:r>
     </w:p>
     <w:p>
@@ -8866,7 +10152,7 @@
       <w:r>
         <w:drawing>
           <wp:inline distT="0" distB="0" distL="0" distR="0">
-            <wp:extent cx="3295650" cy="1876425"/>
+            <wp:extent cx="5305425" cy="1657350"/>
             <wp:effectExtent t="0" r="0" b="0" l="0"/>
             <wp:docPr id="1" name="" descr="" title=""/>
             <wp:cNvGraphicFramePr>
@@ -8891,7 +10177,7 @@
                   <pic:spPr bwMode="auto">
                     <a:xfrm>
                       <a:off x="0" y="0"/>
-                      <a:ext cx="3295650" cy="1876425"/>
+                      <a:ext cx="5305425" cy="1657350"/>
                     </a:xfrm>
                     <a:prstGeom prst="rect">
                       <a:avLst/>
@@ -8917,37 +10203,83 @@
           <w:sz w:val="24"/>
           <w:szCs w:val="24"/>
         </w:rPr>
-        <w:t xml:space="preserve">Figure 6.4: O/C on unseen biomass (Test 2) — raw vs. physics inputs.</w:t>
-      </w:r>
-    </w:p>
-    <w:p>
-      <w:pPr>
-        <w:sectPr>
-          <w:headerReference w:type="default" r:id="rId23"/>
-          <w:footerReference w:type="default" r:id="rId24"/>
-          <w:pgSz w:w="11906" w:h="16838" w:orient="portrait"/>
-          <w:pgMar w:top="1984" w:right="1701" w:bottom="1701" w:left="2268" w:header="708" w:footer="708" w:gutter="0"/>
-          <w:pgNumType w:fmt="decimal"/>
-          <w:docGrid w:linePitch="360"/>
-        </w:sectPr>
-      </w:pPr>
-    </w:p>
-    <w:p>
-      <w:pPr>
-        <w:pStyle w:val="Heading1"/>
-        <w:pageBreakBefore/>
-        <w:spacing w:after="360" w:before="0" w:line="360"/>
-      </w:pPr>
-      <w:r>
-        <w:rPr>
-          <w:rFonts w:ascii="Times New Roman" w:cs="Times New Roman" w:eastAsia="Times New Roman" w:hAnsi="Times New Roman"/>
-          <w:b/>
-          <w:bCs/>
-          <w:color w:val="1F3864"/>
-          <w:sz w:val="32"/>
-          <w:szCs w:val="32"/>
-        </w:rPr>
-        <w:t xml:space="preserve">CHAPTER 7: RESULTS — PART B: PHYSICS-AWARE MODELS AND THE ADVISOR</w:t>
+        <w:t xml:space="preserve">Figure 7.1: Average model response to temperature, with kinetic tar selectivity.</w:t>
+      </w:r>
+    </w:p>
+    <w:p>
+      <w:pPr>
+        <w:pStyle w:val="ListParagraph"/>
+        <w:numPr>
+          <w:ilvl w:val="0"/>
+          <w:numId w:val="2"/>
+        </w:numPr>
+        <w:spacing w:after="120" w:line="360"/>
+        <w:jc w:val="both"/>
+      </w:pPr>
+      <w:r>
+        <w:rPr>
+          <w:rFonts w:ascii="Times New Roman" w:cs="Times New Roman" w:eastAsia="Times New Roman" w:hAnsi="Times New Roman"/>
+          <w:sz w:val="24"/>
+          <w:szCs w:val="24"/>
+        </w:rPr>
+        <w:t xml:space="preserve">Yield peaks at 525°C (41.6 wt%, rising from 36.3 at 350 and falling to 38.2 at 700) — matching the literature's 450–550°C optimum.</w:t>
+      </w:r>
+    </w:p>
+    <w:p>
+      <w:pPr>
+        <w:pStyle w:val="ListParagraph"/>
+        <w:numPr>
+          <w:ilvl w:val="0"/>
+          <w:numId w:val="2"/>
+        </w:numPr>
+        <w:spacing w:after="120" w:line="360"/>
+        <w:jc w:val="both"/>
+      </w:pPr>
+      <w:r>
+        <w:rPr>
+          <w:rFonts w:ascii="Times New Roman" w:cs="Times New Roman" w:eastAsia="Times New Roman" w:hAnsi="Times New Roman"/>
+          <w:sz w:val="24"/>
+          <w:szCs w:val="24"/>
+        </w:rPr>
+        <w:t xml:space="preserve">Tar selectivity rises monotonically (51%→69% across 350–700°C), so the yield fall above ~600°C is consistent with secondary cracking of hot vapours into gas — a two-step behaviour reproduced from data, not told to the model explicitly.</w:t>
+      </w:r>
+    </w:p>
+    <w:p>
+      <w:pPr>
+        <w:pStyle w:val="ListParagraph"/>
+        <w:numPr>
+          <w:ilvl w:val="0"/>
+          <w:numId w:val="2"/>
+        </w:numPr>
+        <w:spacing w:after="120" w:line="360"/>
+        <w:jc w:val="both"/>
+      </w:pPr>
+      <w:r>
+        <w:rPr>
+          <w:rFonts w:ascii="Times New Roman" w:cs="Times New Roman" w:eastAsia="Times New Roman" w:hAnsi="Times New Roman"/>
+          <w:sz w:val="24"/>
+          <w:szCs w:val="24"/>
+        </w:rPr>
+        <w:t xml:space="preserve">O/C falls 0.28→0.21 (350–700°C), consistent with stronger deoxygenation at higher severity, and is guaranteed never to rise with T by the monotonicity constraint.</w:t>
+      </w:r>
+    </w:p>
+    <w:p>
+      <w:pPr>
+        <w:pStyle w:val="ListParagraph"/>
+        <w:numPr>
+          <w:ilvl w:val="0"/>
+          <w:numId w:val="2"/>
+        </w:numPr>
+        <w:spacing w:after="120" w:line="360"/>
+        <w:jc w:val="both"/>
+      </w:pPr>
+      <w:r>
+        <w:rPr>
+          <w:rFonts w:ascii="Times New Roman" w:cs="Times New Roman" w:eastAsia="Times New Roman" w:hAnsi="Times New Roman"/>
+          <w:sz w:val="24"/>
+          <w:szCs w:val="24"/>
+        </w:rPr>
+        <w:t xml:space="preserve">Every D3 experiment has θ&lt;0 (slow, evenly-heated pyrolysis; median HR 25°C/min), so particle-size effects are small and noisy.</w:t>
       </w:r>
     </w:p>
     <w:p>
@@ -8964,995 +10296,7 @@
           <w:sz w:val="28"/>
           <w:szCs w:val="28"/>
         </w:rPr>
-        <w:t xml:space="preserve">7.1 Final Model Selection</w:t>
-      </w:r>
-    </w:p>
-    <w:p>
-      <w:pPr>
-        <w:spacing w:after="200" w:before="0" w:line="360"/>
-        <w:jc w:val="both"/>
-      </w:pPr>
-      <w:r>
-        <w:rPr>
-          <w:rFonts w:ascii="Times New Roman" w:cs="Times New Roman" w:eastAsia="Times New Roman" w:hAnsi="Times New Roman"/>
-          <w:sz w:val="24"/>
-          <w:szCs w:val="24"/>
-        </w:rPr>
-        <w:t xml:space="preserve">Final models were selected on Test 2 (grouped by biomass), the setting that matters when the Advisor meets a new feedstock; on Test 1 the selected models score R² ≈ 0.61 for both targets (Section 6.1). Table 7.1 compares yield candidates. “Shape R²” measures how well a model captures the within-biomass response to conditions — what the Advisor needs. A plain GPR achieves shape R²≈0.01 (ignores conditions); level-plus-shape was selected for its shape R² = 0.12.</w:t>
-      </w:r>
-    </w:p>
-    <w:p>
-      <w:pPr>
-        <w:spacing w:after="300" w:before="100" w:line="276"/>
-        <w:jc w:val="center"/>
-      </w:pPr>
-      <w:r>
-        <w:rPr>
-          <w:rFonts w:ascii="Times New Roman" w:cs="Times New Roman" w:eastAsia="Times New Roman" w:hAnsi="Times New Roman"/>
-          <w:b/>
-          <w:bCs/>
-          <w:sz w:val="24"/>
-          <w:szCs w:val="24"/>
-        </w:rPr>
-        <w:t xml:space="preserve">Table 7.1: Final yield model selection (Test 2, grouped by biomass)</w:t>
-      </w:r>
-    </w:p>
-    <w:tbl>
-      <w:tblPr>
-        <w:tblW w:type="dxa" w:w="8600"/>
-        <w:tblBorders>
-          <w:top w:val="single" w:color="auto" w:sz="4"/>
-          <w:left w:val="single" w:color="auto" w:sz="4"/>
-          <w:bottom w:val="single" w:color="auto" w:sz="4"/>
-          <w:right w:val="single" w:color="auto" w:sz="4"/>
-          <w:insideH w:val="single" w:color="auto" w:sz="4"/>
-          <w:insideV w:val="single" w:color="auto" w:sz="4"/>
-        </w:tblBorders>
-      </w:tblPr>
-      <w:tblGrid>
-        <w:gridCol w:w="3600"/>
-        <w:gridCol w:w="1600"/>
-        <w:gridCol w:w="1600"/>
-        <w:gridCol w:w="1800"/>
-      </w:tblGrid>
-      <w:tr>
-        <w:trPr>
-          <w:tblHeader/>
-        </w:trPr>
-        <w:tc>
-          <w:tcPr>
-            <w:tcW w:type="dxa" w:w="3600"/>
-            <w:shd w:fill="1F3864" w:color="auto" w:val="clear"/>
-            <w:tcMar>
-              <w:top w:type="dxa" w:w="80"/>
-              <w:left w:type="dxa" w:w="100"/>
-              <w:bottom w:type="dxa" w:w="80"/>
-              <w:right w:type="dxa" w:w="100"/>
-            </w:tcMar>
-            <w:vAlign w:val="center"/>
-          </w:tcPr>
-          <w:p>
-            <w:pPr>
-              <w:jc w:val="center"/>
-            </w:pPr>
-            <w:r>
-              <w:rPr>
-                <w:rFonts w:ascii="Times New Roman" w:cs="Times New Roman" w:eastAsia="Times New Roman" w:hAnsi="Times New Roman"/>
-                <w:b/>
-                <w:bCs/>
-                <w:color w:val="FFFFFF"/>
-                <w:sz w:val="20"/>
-                <w:szCs w:val="20"/>
-              </w:rPr>
-              <w:t xml:space="preserve">Model</w:t>
-            </w:r>
-          </w:p>
-        </w:tc>
-        <w:tc>
-          <w:tcPr>
-            <w:tcW w:type="dxa" w:w="1600"/>
-            <w:shd w:fill="1F3864" w:color="auto" w:val="clear"/>
-            <w:tcMar>
-              <w:top w:type="dxa" w:w="80"/>
-              <w:left w:type="dxa" w:w="100"/>
-              <w:bottom w:type="dxa" w:w="80"/>
-              <w:right w:type="dxa" w:w="100"/>
-            </w:tcMar>
-            <w:vAlign w:val="center"/>
-          </w:tcPr>
-          <w:p>
-            <w:pPr>
-              <w:jc w:val="center"/>
-            </w:pPr>
-            <w:r>
-              <w:rPr>
-                <w:rFonts w:ascii="Times New Roman" w:cs="Times New Roman" w:eastAsia="Times New Roman" w:hAnsi="Times New Roman"/>
-                <w:b/>
-                <w:bCs/>
-                <w:color w:val="FFFFFF"/>
-                <w:sz w:val="20"/>
-                <w:szCs w:val="20"/>
-              </w:rPr>
-              <w:t xml:space="preserve">R²</w:t>
-            </w:r>
-          </w:p>
-        </w:tc>
-        <w:tc>
-          <w:tcPr>
-            <w:tcW w:type="dxa" w:w="1600"/>
-            <w:shd w:fill="1F3864" w:color="auto" w:val="clear"/>
-            <w:tcMar>
-              <w:top w:type="dxa" w:w="80"/>
-              <w:left w:type="dxa" w:w="100"/>
-              <w:bottom w:type="dxa" w:w="80"/>
-              <w:right w:type="dxa" w:w="100"/>
-            </w:tcMar>
-            <w:vAlign w:val="center"/>
-          </w:tcPr>
-          <w:p>
-            <w:pPr>
-              <w:jc w:val="center"/>
-            </w:pPr>
-            <w:r>
-              <w:rPr>
-                <w:rFonts w:ascii="Times New Roman" w:cs="Times New Roman" w:eastAsia="Times New Roman" w:hAnsi="Times New Roman"/>
-                <w:b/>
-                <w:bCs/>
-                <w:color w:val="FFFFFF"/>
-                <w:sz w:val="20"/>
-                <w:szCs w:val="20"/>
-              </w:rPr>
-              <w:t xml:space="preserve">MAE (wt%)</w:t>
-            </w:r>
-          </w:p>
-        </w:tc>
-        <w:tc>
-          <w:tcPr>
-            <w:tcW w:type="dxa" w:w="1800"/>
-            <w:shd w:fill="1F3864" w:color="auto" w:val="clear"/>
-            <w:tcMar>
-              <w:top w:type="dxa" w:w="80"/>
-              <w:left w:type="dxa" w:w="100"/>
-              <w:bottom w:type="dxa" w:w="80"/>
-              <w:right w:type="dxa" w:w="100"/>
-            </w:tcMar>
-            <w:vAlign w:val="center"/>
-          </w:tcPr>
-          <w:p>
-            <w:pPr>
-              <w:jc w:val="center"/>
-            </w:pPr>
-            <w:r>
-              <w:rPr>
-                <w:rFonts w:ascii="Times New Roman" w:cs="Times New Roman" w:eastAsia="Times New Roman" w:hAnsi="Times New Roman"/>
-                <w:b/>
-                <w:bCs/>
-                <w:color w:val="FFFFFF"/>
-                <w:sz w:val="20"/>
-                <w:szCs w:val="20"/>
-              </w:rPr>
-              <w:t xml:space="preserve">Shape R²</w:t>
-            </w:r>
-          </w:p>
-        </w:tc>
-      </w:tr>
-      <w:tr>
-        <w:tc>
-          <w:tcPr>
-            <w:tcW w:type="dxa" w:w="3600"/>
-            <w:tcMar>
-              <w:top w:type="dxa" w:w="80"/>
-              <w:left w:type="dxa" w:w="100"/>
-              <w:bottom w:type="dxa" w:w="80"/>
-              <w:right w:type="dxa" w:w="100"/>
-            </w:tcMar>
-            <w:vAlign w:val="center"/>
-          </w:tcPr>
-          <w:p>
-            <w:pPr>
-              <w:jc w:val="left"/>
-            </w:pPr>
-            <w:r>
-              <w:rPr>
-                <w:rFonts w:ascii="Times New Roman" w:cs="Times New Roman" w:eastAsia="Times New Roman" w:hAnsi="Times New Roman"/>
-                <w:color w:val="000000"/>
-                <w:sz w:val="20"/>
-                <w:szCs w:val="20"/>
-              </w:rPr>
-              <w:t xml:space="preserve">Mean only</w:t>
-            </w:r>
-          </w:p>
-        </w:tc>
-        <w:tc>
-          <w:tcPr>
-            <w:tcW w:type="dxa" w:w="1600"/>
-            <w:tcMar>
-              <w:top w:type="dxa" w:w="80"/>
-              <w:left w:type="dxa" w:w="100"/>
-              <w:bottom w:type="dxa" w:w="80"/>
-              <w:right w:type="dxa" w:w="100"/>
-            </w:tcMar>
-            <w:vAlign w:val="center"/>
-          </w:tcPr>
-          <w:p>
-            <w:pPr>
-              <w:jc w:val="center"/>
-            </w:pPr>
-            <w:r>
-              <w:rPr>
-                <w:rFonts w:ascii="Times New Roman" w:cs="Times New Roman" w:eastAsia="Times New Roman" w:hAnsi="Times New Roman"/>
-                <w:color w:val="000000"/>
-                <w:sz w:val="20"/>
-                <w:szCs w:val="20"/>
-              </w:rPr>
-              <w:t xml:space="preserve">−0.09</w:t>
-            </w:r>
-          </w:p>
-        </w:tc>
-        <w:tc>
-          <w:tcPr>
-            <w:tcW w:type="dxa" w:w="1600"/>
-            <w:tcMar>
-              <w:top w:type="dxa" w:w="80"/>
-              <w:left w:type="dxa" w:w="100"/>
-              <w:bottom w:type="dxa" w:w="80"/>
-              <w:right w:type="dxa" w:w="100"/>
-            </w:tcMar>
-            <w:vAlign w:val="center"/>
-          </w:tcPr>
-          <w:p>
-            <w:pPr>
-              <w:jc w:val="center"/>
-            </w:pPr>
-            <w:r>
-              <w:rPr>
-                <w:rFonts w:ascii="Times New Roman" w:cs="Times New Roman" w:eastAsia="Times New Roman" w:hAnsi="Times New Roman"/>
-                <w:color w:val="000000"/>
-                <w:sz w:val="20"/>
-                <w:szCs w:val="20"/>
-              </w:rPr>
-              <w:t xml:space="preserve">8.21</w:t>
-            </w:r>
-          </w:p>
-        </w:tc>
-        <w:tc>
-          <w:tcPr>
-            <w:tcW w:type="dxa" w:w="1800"/>
-            <w:tcMar>
-              <w:top w:type="dxa" w:w="80"/>
-              <w:left w:type="dxa" w:w="100"/>
-              <w:bottom w:type="dxa" w:w="80"/>
-              <w:right w:type="dxa" w:w="100"/>
-            </w:tcMar>
-            <w:vAlign w:val="center"/>
-          </w:tcPr>
-          <w:p>
-            <w:pPr>
-              <w:jc w:val="center"/>
-            </w:pPr>
-            <w:r>
-              <w:rPr>
-                <w:rFonts w:ascii="Times New Roman" w:cs="Times New Roman" w:eastAsia="Times New Roman" w:hAnsi="Times New Roman"/>
-                <w:color w:val="000000"/>
-                <w:sz w:val="20"/>
-                <w:szCs w:val="20"/>
-              </w:rPr>
-              <w:t xml:space="preserve">0</w:t>
-            </w:r>
-          </w:p>
-        </w:tc>
-      </w:tr>
-      <w:tr>
-        <w:tc>
-          <w:tcPr>
-            <w:tcW w:type="dxa" w:w="3600"/>
-            <w:shd w:fill="EDEDED" w:color="auto" w:val="clear"/>
-            <w:tcMar>
-              <w:top w:type="dxa" w:w="80"/>
-              <w:left w:type="dxa" w:w="100"/>
-              <w:bottom w:type="dxa" w:w="80"/>
-              <w:right w:type="dxa" w:w="100"/>
-            </w:tcMar>
-            <w:vAlign w:val="center"/>
-          </w:tcPr>
-          <w:p>
-            <w:pPr>
-              <w:jc w:val="left"/>
-            </w:pPr>
-            <w:r>
-              <w:rPr>
-                <w:rFonts w:ascii="Times New Roman" w:cs="Times New Roman" w:eastAsia="Times New Roman" w:hAnsi="Times New Roman"/>
-                <w:color w:val="000000"/>
-                <w:sz w:val="20"/>
-                <w:szCs w:val="20"/>
-              </w:rPr>
-              <w:t xml:space="preserve">GPR only</w:t>
-            </w:r>
-          </w:p>
-        </w:tc>
-        <w:tc>
-          <w:tcPr>
-            <w:tcW w:type="dxa" w:w="1600"/>
-            <w:shd w:fill="EDEDED" w:color="auto" w:val="clear"/>
-            <w:tcMar>
-              <w:top w:type="dxa" w:w="80"/>
-              <w:left w:type="dxa" w:w="100"/>
-              <w:bottom w:type="dxa" w:w="80"/>
-              <w:right w:type="dxa" w:w="100"/>
-            </w:tcMar>
-            <w:vAlign w:val="center"/>
-          </w:tcPr>
-          <w:p>
-            <w:pPr>
-              <w:jc w:val="center"/>
-            </w:pPr>
-            <w:r>
-              <w:rPr>
-                <w:rFonts w:ascii="Times New Roman" w:cs="Times New Roman" w:eastAsia="Times New Roman" w:hAnsi="Times New Roman"/>
-                <w:color w:val="000000"/>
-                <w:sz w:val="20"/>
-                <w:szCs w:val="20"/>
-              </w:rPr>
-              <w:t xml:space="preserve">0.01</w:t>
-            </w:r>
-          </w:p>
-        </w:tc>
-        <w:tc>
-          <w:tcPr>
-            <w:tcW w:type="dxa" w:w="1600"/>
-            <w:shd w:fill="EDEDED" w:color="auto" w:val="clear"/>
-            <w:tcMar>
-              <w:top w:type="dxa" w:w="80"/>
-              <w:left w:type="dxa" w:w="100"/>
-              <w:bottom w:type="dxa" w:w="80"/>
-              <w:right w:type="dxa" w:w="100"/>
-            </w:tcMar>
-            <w:vAlign w:val="center"/>
-          </w:tcPr>
-          <w:p>
-            <w:pPr>
-              <w:jc w:val="center"/>
-            </w:pPr>
-            <w:r>
-              <w:rPr>
-                <w:rFonts w:ascii="Times New Roman" w:cs="Times New Roman" w:eastAsia="Times New Roman" w:hAnsi="Times New Roman"/>
-                <w:color w:val="000000"/>
-                <w:sz w:val="20"/>
-                <w:szCs w:val="20"/>
-              </w:rPr>
-              <w:t xml:space="preserve">7.70</w:t>
-            </w:r>
-          </w:p>
-        </w:tc>
-        <w:tc>
-          <w:tcPr>
-            <w:tcW w:type="dxa" w:w="1800"/>
-            <w:shd w:fill="EDEDED" w:color="auto" w:val="clear"/>
-            <w:tcMar>
-              <w:top w:type="dxa" w:w="80"/>
-              <w:left w:type="dxa" w:w="100"/>
-              <w:bottom w:type="dxa" w:w="80"/>
-              <w:right w:type="dxa" w:w="100"/>
-            </w:tcMar>
-            <w:vAlign w:val="center"/>
-          </w:tcPr>
-          <w:p>
-            <w:pPr>
-              <w:jc w:val="center"/>
-            </w:pPr>
-            <w:r>
-              <w:rPr>
-                <w:rFonts w:ascii="Times New Roman" w:cs="Times New Roman" w:eastAsia="Times New Roman" w:hAnsi="Times New Roman"/>
-                <w:color w:val="000000"/>
-                <w:sz w:val="20"/>
-                <w:szCs w:val="20"/>
-              </w:rPr>
-              <w:t xml:space="preserve">0.01</w:t>
-            </w:r>
-          </w:p>
-        </w:tc>
-      </w:tr>
-      <w:tr>
-        <w:tc>
-          <w:tcPr>
-            <w:tcW w:type="dxa" w:w="3600"/>
-            <w:tcMar>
-              <w:top w:type="dxa" w:w="80"/>
-              <w:left w:type="dxa" w:w="100"/>
-              <w:bottom w:type="dxa" w:w="80"/>
-              <w:right w:type="dxa" w:w="100"/>
-            </w:tcMar>
-            <w:vAlign w:val="center"/>
-          </w:tcPr>
-          <w:p>
-            <w:pPr>
-              <w:jc w:val="left"/>
-            </w:pPr>
-            <w:r>
-              <w:rPr>
-                <w:rFonts w:ascii="Times New Roman" w:cs="Times New Roman" w:eastAsia="Times New Roman" w:hAnsi="Times New Roman"/>
-                <w:color w:val="000000"/>
-                <w:sz w:val="20"/>
-                <w:szCs w:val="20"/>
-              </w:rPr>
-              <w:t xml:space="preserve">GPR + XGBoost average</w:t>
-            </w:r>
-          </w:p>
-        </w:tc>
-        <w:tc>
-          <w:tcPr>
-            <w:tcW w:type="dxa" w:w="1600"/>
-            <w:tcMar>
-              <w:top w:type="dxa" w:w="80"/>
-              <w:left w:type="dxa" w:w="100"/>
-              <w:bottom w:type="dxa" w:w="80"/>
-              <w:right w:type="dxa" w:w="100"/>
-            </w:tcMar>
-            <w:vAlign w:val="center"/>
-          </w:tcPr>
-          <w:p>
-            <w:pPr>
-              <w:jc w:val="center"/>
-            </w:pPr>
-            <w:r>
-              <w:rPr>
-                <w:rFonts w:ascii="Times New Roman" w:cs="Times New Roman" w:eastAsia="Times New Roman" w:hAnsi="Times New Roman"/>
-                <w:color w:val="000000"/>
-                <w:sz w:val="20"/>
-                <w:szCs w:val="20"/>
-              </w:rPr>
-              <w:t xml:space="preserve">0.07</w:t>
-            </w:r>
-          </w:p>
-        </w:tc>
-        <w:tc>
-          <w:tcPr>
-            <w:tcW w:type="dxa" w:w="1600"/>
-            <w:tcMar>
-              <w:top w:type="dxa" w:w="80"/>
-              <w:left w:type="dxa" w:w="100"/>
-              <w:bottom w:type="dxa" w:w="80"/>
-              <w:right w:type="dxa" w:w="100"/>
-            </w:tcMar>
-            <w:vAlign w:val="center"/>
-          </w:tcPr>
-          <w:p>
-            <w:pPr>
-              <w:jc w:val="center"/>
-            </w:pPr>
-            <w:r>
-              <w:rPr>
-                <w:rFonts w:ascii="Times New Roman" w:cs="Times New Roman" w:eastAsia="Times New Roman" w:hAnsi="Times New Roman"/>
-                <w:color w:val="000000"/>
-                <w:sz w:val="20"/>
-                <w:szCs w:val="20"/>
-              </w:rPr>
-              <w:t xml:space="preserve">7.48</w:t>
-            </w:r>
-          </w:p>
-        </w:tc>
-        <w:tc>
-          <w:tcPr>
-            <w:tcW w:type="dxa" w:w="1800"/>
-            <w:tcMar>
-              <w:top w:type="dxa" w:w="80"/>
-              <w:left w:type="dxa" w:w="100"/>
-              <w:bottom w:type="dxa" w:w="80"/>
-              <w:right w:type="dxa" w:w="100"/>
-            </w:tcMar>
-            <w:vAlign w:val="center"/>
-          </w:tcPr>
-          <w:p>
-            <w:pPr>
-              <w:jc w:val="center"/>
-            </w:pPr>
-            <w:r>
-              <w:rPr>
-                <w:rFonts w:ascii="Times New Roman" w:cs="Times New Roman" w:eastAsia="Times New Roman" w:hAnsi="Times New Roman"/>
-                <w:color w:val="000000"/>
-                <w:sz w:val="20"/>
-                <w:szCs w:val="20"/>
-              </w:rPr>
-              <w:t xml:space="preserve">0.07</w:t>
-            </w:r>
-          </w:p>
-        </w:tc>
-      </w:tr>
-      <w:tr>
-        <w:tc>
-          <w:tcPr>
-            <w:tcW w:type="dxa" w:w="3600"/>
-            <w:shd w:fill="EDEDED" w:color="auto" w:val="clear"/>
-            <w:tcMar>
-              <w:top w:type="dxa" w:w="80"/>
-              <w:left w:type="dxa" w:w="100"/>
-              <w:bottom w:type="dxa" w:w="80"/>
-              <w:right w:type="dxa" w:w="100"/>
-            </w:tcMar>
-            <w:vAlign w:val="center"/>
-          </w:tcPr>
-          <w:p>
-            <w:pPr>
-              <w:jc w:val="left"/>
-            </w:pPr>
-            <w:r>
-              <w:rPr>
-                <w:rFonts w:ascii="Times New Roman" w:cs="Times New Roman" w:eastAsia="Times New Roman" w:hAnsi="Times New Roman"/>
-                <w:color w:val="000000"/>
-                <w:sz w:val="20"/>
-                <w:szCs w:val="20"/>
-              </w:rPr>
-              <w:t xml:space="preserve">Level + shape — final</w:t>
-            </w:r>
-          </w:p>
-        </w:tc>
-        <w:tc>
-          <w:tcPr>
-            <w:tcW w:type="dxa" w:w="1600"/>
-            <w:shd w:fill="EDEDED" w:color="auto" w:val="clear"/>
-            <w:tcMar>
-              <w:top w:type="dxa" w:w="80"/>
-              <w:left w:type="dxa" w:w="100"/>
-              <w:bottom w:type="dxa" w:w="80"/>
-              <w:right w:type="dxa" w:w="100"/>
-            </w:tcMar>
-            <w:vAlign w:val="center"/>
-          </w:tcPr>
-          <w:p>
-            <w:pPr>
-              <w:jc w:val="center"/>
-            </w:pPr>
-            <w:r>
-              <w:rPr>
-                <w:rFonts w:ascii="Times New Roman" w:cs="Times New Roman" w:eastAsia="Times New Roman" w:hAnsi="Times New Roman"/>
-                <w:color w:val="000000"/>
-                <w:sz w:val="20"/>
-                <w:szCs w:val="20"/>
-              </w:rPr>
-              <w:t xml:space="preserve">0.07</w:t>
-            </w:r>
-          </w:p>
-        </w:tc>
-        <w:tc>
-          <w:tcPr>
-            <w:tcW w:type="dxa" w:w="1600"/>
-            <w:shd w:fill="EDEDED" w:color="auto" w:val="clear"/>
-            <w:tcMar>
-              <w:top w:type="dxa" w:w="80"/>
-              <w:left w:type="dxa" w:w="100"/>
-              <w:bottom w:type="dxa" w:w="80"/>
-              <w:right w:type="dxa" w:w="100"/>
-            </w:tcMar>
-            <w:vAlign w:val="center"/>
-          </w:tcPr>
-          <w:p>
-            <w:pPr>
-              <w:jc w:val="center"/>
-            </w:pPr>
-            <w:r>
-              <w:rPr>
-                <w:rFonts w:ascii="Times New Roman" w:cs="Times New Roman" w:eastAsia="Times New Roman" w:hAnsi="Times New Roman"/>
-                <w:color w:val="000000"/>
-                <w:sz w:val="20"/>
-                <w:szCs w:val="20"/>
-              </w:rPr>
-              <w:t xml:space="preserve">7.50</w:t>
-            </w:r>
-          </w:p>
-        </w:tc>
-        <w:tc>
-          <w:tcPr>
-            <w:tcW w:type="dxa" w:w="1800"/>
-            <w:shd w:fill="EDEDED" w:color="auto" w:val="clear"/>
-            <w:tcMar>
-              <w:top w:type="dxa" w:w="80"/>
-              <w:left w:type="dxa" w:w="100"/>
-              <w:bottom w:type="dxa" w:w="80"/>
-              <w:right w:type="dxa" w:w="100"/>
-            </w:tcMar>
-            <w:vAlign w:val="center"/>
-          </w:tcPr>
-          <w:p>
-            <w:pPr>
-              <w:jc w:val="center"/>
-            </w:pPr>
-            <w:r>
-              <w:rPr>
-                <w:rFonts w:ascii="Times New Roman" w:cs="Times New Roman" w:eastAsia="Times New Roman" w:hAnsi="Times New Roman"/>
-                <w:color w:val="000000"/>
-                <w:sz w:val="20"/>
-                <w:szCs w:val="20"/>
-              </w:rPr>
-              <w:t xml:space="preserve">0.12</w:t>
-            </w:r>
-          </w:p>
-        </w:tc>
-      </w:tr>
-    </w:tbl>
-    <w:p>
-      <w:pPr>
-        <w:spacing w:after="300" w:before="100" w:line="276"/>
-        <w:jc w:val="center"/>
-      </w:pPr>
-      <w:r>
-        <w:rPr>
-          <w:rFonts w:ascii="Times New Roman" w:cs="Times New Roman" w:eastAsia="Times New Roman" w:hAnsi="Times New Roman"/>
-          <w:b/>
-          <w:bCs/>
-          <w:sz w:val="24"/>
-          <w:szCs w:val="24"/>
-        </w:rPr>
-        <w:t xml:space="preserve">Table 7.2: Final O/C model selection (Test 2, grouped by biomass)</w:t>
-      </w:r>
-    </w:p>
-    <w:tbl>
-      <w:tblPr>
-        <w:tblW w:type="dxa" w:w="9600"/>
-        <w:tblBorders>
-          <w:top w:val="single" w:color="auto" w:sz="4"/>
-          <w:left w:val="single" w:color="auto" w:sz="4"/>
-          <w:bottom w:val="single" w:color="auto" w:sz="4"/>
-          <w:right w:val="single" w:color="auto" w:sz="4"/>
-          <w:insideH w:val="single" w:color="auto" w:sz="4"/>
-          <w:insideV w:val="single" w:color="auto" w:sz="4"/>
-        </w:tblBorders>
-      </w:tblPr>
-      <w:tblGrid>
-        <w:gridCol w:w="4200"/>
-        <w:gridCol w:w="2400"/>
-        <w:gridCol w:w="3000"/>
-      </w:tblGrid>
-      <w:tr>
-        <w:trPr>
-          <w:tblHeader/>
-        </w:trPr>
-        <w:tc>
-          <w:tcPr>
-            <w:tcW w:type="dxa" w:w="4200"/>
-            <w:shd w:fill="1F3864" w:color="auto" w:val="clear"/>
-            <w:tcMar>
-              <w:top w:type="dxa" w:w="80"/>
-              <w:left w:type="dxa" w:w="100"/>
-              <w:bottom w:type="dxa" w:w="80"/>
-              <w:right w:type="dxa" w:w="100"/>
-            </w:tcMar>
-            <w:vAlign w:val="center"/>
-          </w:tcPr>
-          <w:p>
-            <w:pPr>
-              <w:jc w:val="center"/>
-            </w:pPr>
-            <w:r>
-              <w:rPr>
-                <w:rFonts w:ascii="Times New Roman" w:cs="Times New Roman" w:eastAsia="Times New Roman" w:hAnsi="Times New Roman"/>
-                <w:b/>
-                <w:bCs/>
-                <w:color w:val="FFFFFF"/>
-                <w:sz w:val="20"/>
-                <w:szCs w:val="20"/>
-              </w:rPr>
-              <w:t xml:space="preserve">Model</w:t>
-            </w:r>
-          </w:p>
-        </w:tc>
-        <w:tc>
-          <w:tcPr>
-            <w:tcW w:type="dxa" w:w="2400"/>
-            <w:shd w:fill="1F3864" w:color="auto" w:val="clear"/>
-            <w:tcMar>
-              <w:top w:type="dxa" w:w="80"/>
-              <w:left w:type="dxa" w:w="100"/>
-              <w:bottom w:type="dxa" w:w="80"/>
-              <w:right w:type="dxa" w:w="100"/>
-            </w:tcMar>
-            <w:vAlign w:val="center"/>
-          </w:tcPr>
-          <w:p>
-            <w:pPr>
-              <w:jc w:val="center"/>
-            </w:pPr>
-            <w:r>
-              <w:rPr>
-                <w:rFonts w:ascii="Times New Roman" w:cs="Times New Roman" w:eastAsia="Times New Roman" w:hAnsi="Times New Roman"/>
-                <w:b/>
-                <w:bCs/>
-                <w:color w:val="FFFFFF"/>
-                <w:sz w:val="20"/>
-                <w:szCs w:val="20"/>
-              </w:rPr>
-              <w:t xml:space="preserve">R² (log)</w:t>
-            </w:r>
-          </w:p>
-        </w:tc>
-        <w:tc>
-          <w:tcPr>
-            <w:tcW w:type="dxa" w:w="3000"/>
-            <w:shd w:fill="1F3864" w:color="auto" w:val="clear"/>
-            <w:tcMar>
-              <w:top w:type="dxa" w:w="80"/>
-              <w:left w:type="dxa" w:w="100"/>
-              <w:bottom w:type="dxa" w:w="80"/>
-              <w:right w:type="dxa" w:w="100"/>
-            </w:tcMar>
-            <w:vAlign w:val="center"/>
-          </w:tcPr>
-          <w:p>
-            <w:pPr>
-              <w:jc w:val="center"/>
-            </w:pPr>
-            <w:r>
-              <w:rPr>
-                <w:rFonts w:ascii="Times New Roman" w:cs="Times New Roman" w:eastAsia="Times New Roman" w:hAnsi="Times New Roman"/>
-                <w:b/>
-                <w:bCs/>
-                <w:color w:val="FFFFFF"/>
-                <w:sz w:val="20"/>
-                <w:szCs w:val="20"/>
-              </w:rPr>
-              <w:t xml:space="preserve">Typical error (MedAPE)</w:t>
-            </w:r>
-          </w:p>
-        </w:tc>
-      </w:tr>
-      <w:tr>
-        <w:tc>
-          <w:tcPr>
-            <w:tcW w:type="dxa" w:w="4200"/>
-            <w:tcMar>
-              <w:top w:type="dxa" w:w="80"/>
-              <w:left w:type="dxa" w:w="100"/>
-              <w:bottom w:type="dxa" w:w="80"/>
-              <w:right w:type="dxa" w:w="100"/>
-            </w:tcMar>
-            <w:vAlign w:val="center"/>
-          </w:tcPr>
-          <w:p>
-            <w:pPr>
-              <w:jc w:val="left"/>
-            </w:pPr>
-            <w:r>
-              <w:rPr>
-                <w:rFonts w:ascii="Times New Roman" w:cs="Times New Roman" w:eastAsia="Times New Roman" w:hAnsi="Times New Roman"/>
-                <w:color w:val="000000"/>
-                <w:sz w:val="20"/>
-                <w:szCs w:val="20"/>
-              </w:rPr>
-              <w:t xml:space="preserve">GPR only</w:t>
-            </w:r>
-          </w:p>
-        </w:tc>
-        <w:tc>
-          <w:tcPr>
-            <w:tcW w:type="dxa" w:w="2400"/>
-            <w:tcMar>
-              <w:top w:type="dxa" w:w="80"/>
-              <w:left w:type="dxa" w:w="100"/>
-              <w:bottom w:type="dxa" w:w="80"/>
-              <w:right w:type="dxa" w:w="100"/>
-            </w:tcMar>
-            <w:vAlign w:val="center"/>
-          </w:tcPr>
-          <w:p>
-            <w:pPr>
-              <w:jc w:val="center"/>
-            </w:pPr>
-            <w:r>
-              <w:rPr>
-                <w:rFonts w:ascii="Times New Roman" w:cs="Times New Roman" w:eastAsia="Times New Roman" w:hAnsi="Times New Roman"/>
-                <w:color w:val="000000"/>
-                <w:sz w:val="20"/>
-                <w:szCs w:val="20"/>
-              </w:rPr>
-              <w:t xml:space="preserve">0.23 (log)</w:t>
-            </w:r>
-          </w:p>
-        </w:tc>
-        <w:tc>
-          <w:tcPr>
-            <w:tcW w:type="dxa" w:w="3000"/>
-            <w:tcMar>
-              <w:top w:type="dxa" w:w="80"/>
-              <w:left w:type="dxa" w:w="100"/>
-              <w:bottom w:type="dxa" w:w="80"/>
-              <w:right w:type="dxa" w:w="100"/>
-            </w:tcMar>
-            <w:vAlign w:val="center"/>
-          </w:tcPr>
-          <w:p>
-            <w:pPr>
-              <w:jc w:val="center"/>
-            </w:pPr>
-            <w:r>
-              <w:rPr>
-                <w:rFonts w:ascii="Times New Roman" w:cs="Times New Roman" w:eastAsia="Times New Roman" w:hAnsi="Times New Roman"/>
-                <w:color w:val="000000"/>
-                <w:sz w:val="20"/>
-                <w:szCs w:val="20"/>
-              </w:rPr>
-              <w:t xml:space="preserve">27.7% typical</w:t>
-            </w:r>
-          </w:p>
-        </w:tc>
-      </w:tr>
-      <w:tr>
-        <w:tc>
-          <w:tcPr>
-            <w:tcW w:type="dxa" w:w="4200"/>
-            <w:shd w:fill="EDEDED" w:color="auto" w:val="clear"/>
-            <w:tcMar>
-              <w:top w:type="dxa" w:w="80"/>
-              <w:left w:type="dxa" w:w="100"/>
-              <w:bottom w:type="dxa" w:w="80"/>
-              <w:right w:type="dxa" w:w="100"/>
-            </w:tcMar>
-            <w:vAlign w:val="center"/>
-          </w:tcPr>
-          <w:p>
-            <w:pPr>
-              <w:jc w:val="left"/>
-            </w:pPr>
-            <w:r>
-              <w:rPr>
-                <w:rFonts w:ascii="Times New Roman" w:cs="Times New Roman" w:eastAsia="Times New Roman" w:hAnsi="Times New Roman"/>
-                <w:color w:val="000000"/>
-                <w:sz w:val="20"/>
-                <w:szCs w:val="20"/>
-              </w:rPr>
-              <w:t xml:space="preserve">XGBoost, physics constraints</w:t>
-            </w:r>
-          </w:p>
-        </w:tc>
-        <w:tc>
-          <w:tcPr>
-            <w:tcW w:type="dxa" w:w="2400"/>
-            <w:shd w:fill="EDEDED" w:color="auto" w:val="clear"/>
-            <w:tcMar>
-              <w:top w:type="dxa" w:w="80"/>
-              <w:left w:type="dxa" w:w="100"/>
-              <w:bottom w:type="dxa" w:w="80"/>
-              <w:right w:type="dxa" w:w="100"/>
-            </w:tcMar>
-            <w:vAlign w:val="center"/>
-          </w:tcPr>
-          <w:p>
-            <w:pPr>
-              <w:jc w:val="center"/>
-            </w:pPr>
-            <w:r>
-              <w:rPr>
-                <w:rFonts w:ascii="Times New Roman" w:cs="Times New Roman" w:eastAsia="Times New Roman" w:hAnsi="Times New Roman"/>
-                <w:color w:val="000000"/>
-                <w:sz w:val="20"/>
-                <w:szCs w:val="20"/>
-              </w:rPr>
-              <w:t xml:space="preserve">0.14 (log)</w:t>
-            </w:r>
-          </w:p>
-        </w:tc>
-        <w:tc>
-          <w:tcPr>
-            <w:tcW w:type="dxa" w:w="3000"/>
-            <w:shd w:fill="EDEDED" w:color="auto" w:val="clear"/>
-            <w:tcMar>
-              <w:top w:type="dxa" w:w="80"/>
-              <w:left w:type="dxa" w:w="100"/>
-              <w:bottom w:type="dxa" w:w="80"/>
-              <w:right w:type="dxa" w:w="100"/>
-            </w:tcMar>
-            <w:vAlign w:val="center"/>
-          </w:tcPr>
-          <w:p>
-            <w:pPr>
-              <w:jc w:val="center"/>
-            </w:pPr>
-            <w:r>
-              <w:rPr>
-                <w:rFonts w:ascii="Times New Roman" w:cs="Times New Roman" w:eastAsia="Times New Roman" w:hAnsi="Times New Roman"/>
-                <w:color w:val="000000"/>
-                <w:sz w:val="20"/>
-                <w:szCs w:val="20"/>
-              </w:rPr>
-              <w:t xml:space="preserve">37.5% typical</w:t>
-            </w:r>
-          </w:p>
-        </w:tc>
-      </w:tr>
-      <w:tr>
-        <w:tc>
-          <w:tcPr>
-            <w:tcW w:type="dxa" w:w="4200"/>
-            <w:tcMar>
-              <w:top w:type="dxa" w:w="80"/>
-              <w:left w:type="dxa" w:w="100"/>
-              <w:bottom w:type="dxa" w:w="80"/>
-              <w:right w:type="dxa" w:w="100"/>
-            </w:tcMar>
-            <w:vAlign w:val="center"/>
-          </w:tcPr>
-          <w:p>
-            <w:pPr>
-              <w:jc w:val="left"/>
-            </w:pPr>
-            <w:r>
-              <w:rPr>
-                <w:rFonts w:ascii="Times New Roman" w:cs="Times New Roman" w:eastAsia="Times New Roman" w:hAnsi="Times New Roman"/>
-                <w:color w:val="000000"/>
-                <w:sz w:val="20"/>
-                <w:szCs w:val="20"/>
-              </w:rPr>
-              <w:t xml:space="preserve">Blend — final</w:t>
-            </w:r>
-          </w:p>
-        </w:tc>
-        <w:tc>
-          <w:tcPr>
-            <w:tcW w:type="dxa" w:w="2400"/>
-            <w:tcMar>
-              <w:top w:type="dxa" w:w="80"/>
-              <w:left w:type="dxa" w:w="100"/>
-              <w:bottom w:type="dxa" w:w="80"/>
-              <w:right w:type="dxa" w:w="100"/>
-            </w:tcMar>
-            <w:vAlign w:val="center"/>
-          </w:tcPr>
-          <w:p>
-            <w:pPr>
-              <w:jc w:val="center"/>
-            </w:pPr>
-            <w:r>
-              <w:rPr>
-                <w:rFonts w:ascii="Times New Roman" w:cs="Times New Roman" w:eastAsia="Times New Roman" w:hAnsi="Times New Roman"/>
-                <w:color w:val="000000"/>
-                <w:sz w:val="20"/>
-                <w:szCs w:val="20"/>
-              </w:rPr>
-              <w:t xml:space="preserve">0.26 (log)</w:t>
-            </w:r>
-          </w:p>
-        </w:tc>
-        <w:tc>
-          <w:tcPr>
-            <w:tcW w:type="dxa" w:w="3000"/>
-            <w:tcMar>
-              <w:top w:type="dxa" w:w="80"/>
-              <w:left w:type="dxa" w:w="100"/>
-              <w:bottom w:type="dxa" w:w="80"/>
-              <w:right w:type="dxa" w:w="100"/>
-            </w:tcMar>
-            <w:vAlign w:val="center"/>
-          </w:tcPr>
-          <w:p>
-            <w:pPr>
-              <w:jc w:val="center"/>
-            </w:pPr>
-            <w:r>
-              <w:rPr>
-                <w:rFonts w:ascii="Times New Roman" w:cs="Times New Roman" w:eastAsia="Times New Roman" w:hAnsi="Times New Roman"/>
-                <w:color w:val="000000"/>
-                <w:sz w:val="20"/>
-                <w:szCs w:val="20"/>
-              </w:rPr>
-              <w:t xml:space="preserve">32.1% typical</w:t>
-            </w:r>
-          </w:p>
-        </w:tc>
-      </w:tr>
-    </w:tbl>
-    <w:p>
-      <w:pPr>
-        <w:pStyle w:val="Heading2"/>
-        <w:spacing w:after="200" w:before="300" w:line="360"/>
-      </w:pPr>
-      <w:r>
-        <w:rPr>
-          <w:rFonts w:ascii="Times New Roman" w:cs="Times New Roman" w:eastAsia="Times New Roman" w:hAnsi="Times New Roman"/>
-          <w:b/>
-          <w:bCs/>
-          <w:color w:val="1F3864"/>
-          <w:sz w:val="28"/>
-          <w:szCs w:val="28"/>
-        </w:rPr>
-        <w:t xml:space="preserve">7.2 Physics Consistency Checks</w:t>
+        <w:t xml:space="preserve">7.3 Uncertainty and Calibration</w:t>
       </w:r>
     </w:p>
     <w:p>
@@ -9963,7 +10307,7 @@
       <w:r>
         <w:drawing>
           <wp:inline distT="0" distB="0" distL="0" distR="0">
-            <wp:extent cx="5305425" cy="1657350"/>
+            <wp:extent cx="4391025" cy="2333625"/>
             <wp:effectExtent t="0" r="0" b="0" l="0"/>
             <wp:docPr id="1" name="" descr="" title=""/>
             <wp:cNvGraphicFramePr>
@@ -9988,7 +10332,7 @@
                   <pic:spPr bwMode="auto">
                     <a:xfrm>
                       <a:off x="0" y="0"/>
-                      <a:ext cx="5305425" cy="1657350"/>
+                      <a:ext cx="4391025" cy="2333625"/>
                     </a:xfrm>
                     <a:prstGeom prst="rect">
                       <a:avLst/>
@@ -10014,17 +10358,12 @@
           <w:sz w:val="24"/>
           <w:szCs w:val="24"/>
         </w:rPr>
-        <w:t xml:space="preserve">Figure 7.1: Average model response to temperature, with kinetic tar selectivity.</w:t>
-      </w:r>
-    </w:p>
-    <w:p>
-      <w:pPr>
-        <w:pStyle w:val="ListParagraph"/>
-        <w:numPr>
-          <w:ilvl w:val="0"/>
-          <w:numId w:val="2"/>
-        </w:numPr>
-        <w:spacing w:after="120" w:line="360"/>
+        <w:t xml:space="preserve">Figure 7.2: Yield error for a new biomass with 0, 1 or 2 real experiments.</w:t>
+      </w:r>
+    </w:p>
+    <w:p>
+      <w:pPr>
+        <w:spacing w:after="200" w:before="0" w:line="360"/>
         <w:jc w:val="both"/>
       </w:pPr>
       <w:r>
@@ -10033,64 +10372,7 @@
           <w:sz w:val="24"/>
           <w:szCs w:val="24"/>
         </w:rPr>
-        <w:t xml:space="preserve">Yield peaks at 525°C (41.6 wt%, rising from 36.3 at 350 and falling to 38.2 at 700) — matching the literature's 450–550°C optimum.</w:t>
-      </w:r>
-    </w:p>
-    <w:p>
-      <w:pPr>
-        <w:pStyle w:val="ListParagraph"/>
-        <w:numPr>
-          <w:ilvl w:val="0"/>
-          <w:numId w:val="2"/>
-        </w:numPr>
-        <w:spacing w:after="120" w:line="360"/>
-        <w:jc w:val="both"/>
-      </w:pPr>
-      <w:r>
-        <w:rPr>
-          <w:rFonts w:ascii="Times New Roman" w:cs="Times New Roman" w:eastAsia="Times New Roman" w:hAnsi="Times New Roman"/>
-          <w:sz w:val="24"/>
-          <w:szCs w:val="24"/>
-        </w:rPr>
-        <w:t xml:space="preserve">Tar selectivity rises monotonically (51%→69% across 350–700°C), so the yield fall above ~600°C is consistent with secondary cracking of hot vapours into gas — a two-step behaviour reproduced from data, not told to the model explicitly.</w:t>
-      </w:r>
-    </w:p>
-    <w:p>
-      <w:pPr>
-        <w:pStyle w:val="ListParagraph"/>
-        <w:numPr>
-          <w:ilvl w:val="0"/>
-          <w:numId w:val="2"/>
-        </w:numPr>
-        <w:spacing w:after="120" w:line="360"/>
-        <w:jc w:val="both"/>
-      </w:pPr>
-      <w:r>
-        <w:rPr>
-          <w:rFonts w:ascii="Times New Roman" w:cs="Times New Roman" w:eastAsia="Times New Roman" w:hAnsi="Times New Roman"/>
-          <w:sz w:val="24"/>
-          <w:szCs w:val="24"/>
-        </w:rPr>
-        <w:t xml:space="preserve">O/C falls 0.28→0.21 (350–700°C), consistent with stronger deoxygenation at higher severity, and is guaranteed never to rise with T by the monotonicity constraint.</w:t>
-      </w:r>
-    </w:p>
-    <w:p>
-      <w:pPr>
-        <w:pStyle w:val="ListParagraph"/>
-        <w:numPr>
-          <w:ilvl w:val="0"/>
-          <w:numId w:val="2"/>
-        </w:numPr>
-        <w:spacing w:after="120" w:line="360"/>
-        <w:jc w:val="both"/>
-      </w:pPr>
-      <w:r>
-        <w:rPr>
-          <w:rFonts w:ascii="Times New Roman" w:cs="Times New Roman" w:eastAsia="Times New Roman" w:hAnsi="Times New Roman"/>
-          <w:sz w:val="24"/>
-          <w:szCs w:val="24"/>
-        </w:rPr>
-        <w:t xml:space="preserve">Every D3 experiment has θ&lt;0 (slow, evenly-heated pyrolysis; median HR 25°C/min), so particle-size effects are small and noisy.</w:t>
+        <w:t xml:space="preserve">80% intervals for a brand-new biomass (Test 2): yield ±12.6 wt%, O/C within a factor of 2.2. One calibration experiment cuts yield error from ~8 to 5.3 wt%; two bring it to 4.2 wt% — beating simple reuse of the measured value (5.7, 4.6 wt%) because the model adds learned condition-response. For O/C the reverse held (reuse: log error 0.087 vs. model 0.104), since O/C varies little within a biomass in D1b.</w:t>
       </w:r>
     </w:p>
     <w:p>
@@ -10107,7 +10389,7 @@
           <w:sz w:val="28"/>
           <w:szCs w:val="28"/>
         </w:rPr>
-        <w:t xml:space="preserve">7.3 Uncertainty and Calibration</w:t>
+        <w:t xml:space="preserve">7.4 Case Studies: Three Unseen Biomasses</w:t>
       </w:r>
     </w:p>
     <w:p>
@@ -10118,7 +10400,7 @@
       <w:r>
         <w:drawing>
           <wp:inline distT="0" distB="0" distL="0" distR="0">
-            <wp:extent cx="4391025" cy="2333625"/>
+            <wp:extent cx="5305425" cy="1657350"/>
             <wp:effectExtent t="0" r="0" b="0" l="0"/>
             <wp:docPr id="1" name="" descr="" title=""/>
             <wp:cNvGraphicFramePr>
@@ -10143,99 +10425,6 @@
                   <pic:spPr bwMode="auto">
                     <a:xfrm>
                       <a:off x="0" y="0"/>
-                      <a:ext cx="4391025" cy="2333625"/>
-                    </a:xfrm>
-                    <a:prstGeom prst="rect">
-                      <a:avLst/>
-                    </a:prstGeom>
-                  </pic:spPr>
-                </pic:pic>
-              </a:graphicData>
-            </a:graphic>
-          </wp:inline>
-        </w:drawing>
-      </w:r>
-    </w:p>
-    <w:p>
-      <w:pPr>
-        <w:spacing w:after="300" w:before="100" w:line="276"/>
-        <w:jc w:val="center"/>
-      </w:pPr>
-      <w:r>
-        <w:rPr>
-          <w:rFonts w:ascii="Times New Roman" w:cs="Times New Roman" w:eastAsia="Times New Roman" w:hAnsi="Times New Roman"/>
-          <w:b/>
-          <w:bCs/>
-          <w:sz w:val="24"/>
-          <w:szCs w:val="24"/>
-        </w:rPr>
-        <w:t xml:space="preserve">Figure 7.2: Yield error for a new biomass with 0, 1 or 2 real experiments.</w:t>
-      </w:r>
-    </w:p>
-    <w:p>
-      <w:pPr>
-        <w:spacing w:after="200" w:before="0" w:line="360"/>
-        <w:jc w:val="both"/>
-      </w:pPr>
-      <w:r>
-        <w:rPr>
-          <w:rFonts w:ascii="Times New Roman" w:cs="Times New Roman" w:eastAsia="Times New Roman" w:hAnsi="Times New Roman"/>
-          <w:sz w:val="24"/>
-          <w:szCs w:val="24"/>
-        </w:rPr>
-        <w:t xml:space="preserve">80% intervals for a brand-new biomass (Test 2): yield ±12.6 wt%, O/C within a factor of 2.2. One calibration experiment cuts yield error from ~8 to 5.3 wt%; two bring it to 4.2 wt% — beating simple reuse of the measured value (5.7, 4.6 wt%) because the model adds learned condition-response. For O/C the reverse held (reuse: log error 0.087 vs. model 0.104), since O/C varies little within a biomass in D1b.</w:t>
-      </w:r>
-    </w:p>
-    <w:p>
-      <w:pPr>
-        <w:pStyle w:val="Heading2"/>
-        <w:spacing w:after="200" w:before="300" w:line="360"/>
-      </w:pPr>
-      <w:r>
-        <w:rPr>
-          <w:rFonts w:ascii="Times New Roman" w:cs="Times New Roman" w:eastAsia="Times New Roman" w:hAnsi="Times New Roman"/>
-          <w:b/>
-          <w:bCs/>
-          <w:color w:val="1F3864"/>
-          <w:sz w:val="28"/>
-          <w:szCs w:val="28"/>
-        </w:rPr>
-        <w:t xml:space="preserve">7.4 Case Studies: Three Unseen Biomasses</w:t>
-      </w:r>
-    </w:p>
-    <w:p>
-      <w:pPr>
-        <w:spacing w:after="100" w:before="200"/>
-        <w:jc w:val="center"/>
-      </w:pPr>
-      <w:r>
-        <w:drawing>
-          <wp:inline distT="0" distB="0" distL="0" distR="0">
-            <wp:extent cx="5305425" cy="1657350"/>
-            <wp:effectExtent t="0" r="0" b="0" l="0"/>
-            <wp:docPr id="1" name="" descr="" title=""/>
-            <wp:cNvGraphicFramePr>
-              <a:graphicFrameLocks xmlns:a="http://schemas.openxmlformats.org/drawingml/2006/main" noChangeAspect="1"/>
-            </wp:cNvGraphicFramePr>
-            <a:graphic xmlns:a="http://schemas.openxmlformats.org/drawingml/2006/main">
-              <a:graphicData uri="http://schemas.openxmlformats.org/drawingml/2006/picture">
-                <pic:pic xmlns:pic="http://schemas.openxmlformats.org/drawingml/2006/picture">
-                  <pic:nvPicPr>
-                    <pic:cNvPr id="0" name="" descr=""/>
-                    <pic:cNvPicPr>
-                      <a:picLocks noChangeAspect="1" noChangeArrowheads="1"/>
-                    </pic:cNvPicPr>
-                  </pic:nvPicPr>
-                  <pic:blipFill>
-                    <a:blip r:embed="rId42" cstate="none"/>
-                    <a:srcRect/>
-                    <a:stretch>
-                      <a:fillRect/>
-                    </a:stretch>
-                  </pic:blipFill>
-                  <pic:spPr bwMode="auto">
-                    <a:xfrm>
-                      <a:off x="0" y="0"/>
                       <a:ext cx="5305425" cy="1657350"/>
                     </a:xfrm>
                     <a:prstGeom prst="rect">
@@ -10907,7 +11096,7 @@
                     </pic:cNvPicPr>
                   </pic:nvPicPr>
                   <pic:blipFill>
-                    <a:blip r:embed="rId43" cstate="none"/>
+                    <a:blip r:embed="rId42" cstate="none"/>
                     <a:srcRect/>
                     <a:stretch>
                       <a:fillRect/>
@@ -14094,6 +14283,35 @@
       <w:szCs w:val="20"/>
     </w:rPr>
   </w:style>
+  <w:style w:type="paragraph" w:styleId="TOC1">
+    <w:name w:val="toc 1"/>
+    <w:basedOn w:val="Normal"/>
+    <w:next w:val="Normal"/>
+    <w:pPr>
+      <w:spacing w:after="0" w:before="60" w:line="276"/>
+    </w:pPr>
+    <w:rPr>
+      <w:rFonts w:ascii="Times New Roman" w:cs="Times New Roman" w:eastAsia="Times New Roman" w:hAnsi="Times New Roman"/>
+      <w:b/>
+      <w:bCs/>
+      <w:sz w:val="24"/>
+      <w:szCs w:val="24"/>
+    </w:rPr>
+  </w:style>
+  <w:style w:type="paragraph" w:styleId="TOC2">
+    <w:name w:val="toc 2"/>
+    <w:basedOn w:val="Normal"/>
+    <w:next w:val="Normal"/>
+    <w:pPr>
+      <w:spacing w:after="0" w:before="0" w:line="276"/>
+      <w:ind w:left="360"/>
+    </w:pPr>
+    <w:rPr>
+      <w:rFonts w:ascii="Times New Roman" w:cs="Times New Roman" w:eastAsia="Times New Roman" w:hAnsi="Times New Roman"/>
+      <w:sz w:val="24"/>
+      <w:szCs w:val="24"/>
+    </w:rPr>
+  </w:style>
   <w:style w:type="paragraph" w:styleId="Heading1">
     <w:name w:val="Heading 1"/>
     <w:basedOn w:val="Normal"/>

</xml_diff>